<commit_message>
Correct catalog route and refine ADR relevance classification
</commit_message>
<xml_diff>
--- a/report/hardware_commonality_report.docx
+++ b/report/hardware_commonality_report.docx
@@ -50,7 +50,7 @@
         <w:pStyle w:val="ListBullet"/>
       </w:pPr>
       <w:r>
-        <w:t>**VERIFIED:** 45 MoparAmerica exploded-diagram records were collected with local images and source URLs.</w:t>
+        <w:t>**VERIFIED:** 46 MoparAmerica exploded-diagram records were collected with local images and source URLs.</w:t>
       </w:r>
     </w:p>
     <w:p>
@@ -58,7 +58,7 @@
         <w:pStyle w:val="ListBullet"/>
       </w:pPr>
       <w:r>
-        <w:t>**VERIFIED:** 1435 raw catalog-part rows were parsed and reduced to 606 deduplicated VIN/category candidates.</w:t>
+        <w:t>**VERIFIED:** 1485 raw catalog-part rows were parsed and reduced to 635 deduplicated VIN/category candidates.</w:t>
       </w:r>
     </w:p>
     <w:p>
@@ -66,7 +66,7 @@
         <w:pStyle w:val="ListBullet"/>
       </w:pPr>
       <w:r>
-        <w:t>**VERIFIED:** 86 candidate part numbers occur in both vehicle catalog routes; 63 are selected as ADR-critical by component keyword/scope.</w:t>
+        <w:t>**VERIFIED:** 106 candidate part numbers occur in both vehicle catalog routes. A broad ADR-relevance keyword screen returns 76; a conservative direct-safety subset contains 51. Neither classification proves VIN installation.</w:t>
       </w:r>
     </w:p>
     <w:p>
@@ -245,7 +245,7 @@
               <w:rPr>
                 <w:sz w:val="16"/>
               </w:rPr>
-              <w:t>2017 Chrysler 300C 3.6L V6 RWD / C 3.6L V6 Flex</w:t>
+              <w:t>2017 Chrysler 300C 3.6L V6 RWD / C 3.6L V6 Gas</w:t>
             </w:r>
           </w:p>
         </w:tc>
@@ -2649,7 +2649,7 @@
               <w:rPr>
                 <w:sz w:val="14"/>
               </w:rPr>
-              <w:t>0</w:t>
+              <w:t>29</w:t>
             </w:r>
           </w:p>
         </w:tc>
@@ -2663,7 +2663,7 @@
               <w:rPr>
                 <w:sz w:val="14"/>
               </w:rPr>
-              <w:t>0</w:t>
+              <w:t>19</w:t>
             </w:r>
           </w:p>
         </w:tc>
@@ -2677,7 +2677,7 @@
               <w:rPr>
                 <w:sz w:val="14"/>
               </w:rPr>
-              <w:t>0.0</w:t>
+              <w:t>0.6129</w:t>
             </w:r>
           </w:p>
         </w:tc>
@@ -2807,7 +2807,7 @@
               <w:rPr>
                 <w:sz w:val="14"/>
               </w:rPr>
-              <w:t>10</w:t>
+              <w:t>11</w:t>
             </w:r>
           </w:p>
         </w:tc>
@@ -2821,7 +2821,7 @@
               <w:rPr>
                 <w:sz w:val="14"/>
               </w:rPr>
-              <w:t>0.3571</w:t>
+              <w:t>0.4074</w:t>
             </w:r>
           </w:p>
         </w:tc>
@@ -3358,7 +3358,7 @@
               <w:rPr>
                 <w:sz w:val="12"/>
               </w:rPr>
-              <w:t>LIKELY BUILD-APPLICABLE.</w:t>
+              <w:t>ADR 5 is likely relevant; exact edition requires model-lineage/acceptable-prior-rule confirmation.</w:t>
             </w:r>
           </w:p>
         </w:tc>
@@ -3878,7 +3878,7 @@
               <w:rPr>
                 <w:sz w:val="12"/>
               </w:rPr>
-              <w:t>34/02</w:t>
+              <w:t>25/02</w:t>
             </w:r>
           </w:p>
         </w:tc>
@@ -3892,7 +3892,7 @@
               <w:rPr>
                 <w:sz w:val="12"/>
               </w:rPr>
-              <w:t>Child Restraint Anchorages and Child Restraint Anchor Fittings</w:t>
+              <w:t>Anti-Theft Lock</w:t>
             </w:r>
           </w:p>
         </w:tc>
@@ -3906,7 +3906,7 @@
               <w:rPr>
                 <w:sz w:val="12"/>
               </w:rPr>
-              <w:t>core</w:t>
+              <w:t>ancillary interior</w:t>
             </w:r>
           </w:p>
         </w:tc>
@@ -3920,7 +3920,7 @@
               <w:rPr>
                 <w:sz w:val="12"/>
               </w:rPr>
-              <w:t>Top-tether and lower anchorage hardware, rear seat interfaces</w:t>
+              <w:t>Steering lock/ignition interlock and controls</w:t>
             </w:r>
           </w:p>
         </w:tc>
@@ -3934,7 +3934,7 @@
               <w:rPr>
                 <w:sz w:val="12"/>
               </w:rPr>
-              <w:t>LIKELY 2017 BUILD-APPLICABLE EDITION; ADR 34/03 was made later in 2017.</w:t>
+              <w:t>LIKELY BUILD-APPLICABLE; no direct lock-system comparison completed.</w:t>
             </w:r>
           </w:p>
         </w:tc>
@@ -3950,7 +3950,7 @@
               <w:rPr>
                 <w:sz w:val="12"/>
               </w:rPr>
-              <w:t>69/00</w:t>
+              <w:t>29/00</w:t>
             </w:r>
           </w:p>
         </w:tc>
@@ -3964,7 +3964,7 @@
               <w:rPr>
                 <w:sz w:val="12"/>
               </w:rPr>
-              <w:t>Full Frontal Impact Occupant Protection</w:t>
+              <w:t>Side Door Strength</w:t>
             </w:r>
           </w:p>
         </w:tc>
@@ -3978,7 +3978,7 @@
               <w:rPr>
                 <w:sz w:val="12"/>
               </w:rPr>
-              <w:t>system-level</w:t>
+              <w:t>system-level/body</w:t>
             </w:r>
           </w:p>
         </w:tc>
@@ -3992,7 +3992,7 @@
               <w:rPr>
                 <w:sz w:val="12"/>
               </w:rPr>
-              <w:t>Airbags, belts/pretensioners, seats, steering column and sensors as a restraint system</w:t>
+              <w:t>Door beams, latches, hinges and side structure</w:t>
             </w:r>
           </w:p>
         </w:tc>
@@ -4022,7 +4022,7 @@
               <w:rPr>
                 <w:sz w:val="12"/>
               </w:rPr>
-              <w:t>72/00</w:t>
+              <w:t>34/02</w:t>
             </w:r>
           </w:p>
         </w:tc>
@@ -4036,7 +4036,7 @@
               <w:rPr>
                 <w:sz w:val="12"/>
               </w:rPr>
-              <w:t>Dynamic Side Impact Occupant Protection</w:t>
+              <w:t>Child Restraint Anchorages and Child Restraint Anchor Fittings</w:t>
             </w:r>
           </w:p>
         </w:tc>
@@ -4050,7 +4050,7 @@
               <w:rPr>
                 <w:sz w:val="12"/>
               </w:rPr>
-              <w:t>system-level</w:t>
+              <w:t>core</w:t>
             </w:r>
           </w:p>
         </w:tc>
@@ -4064,7 +4064,7 @@
               <w:rPr>
                 <w:sz w:val="12"/>
               </w:rPr>
-              <w:t>Side-curtain and seat-mounted airbags, seats, belts, door/side structure and sensors</w:t>
+              <w:t>Top-tether and lower anchorage hardware, rear seat interfaces</w:t>
             </w:r>
           </w:p>
         </w:tc>
@@ -4078,7 +4078,7 @@
               <w:rPr>
                 <w:sz w:val="12"/>
               </w:rPr>
-              <w:t>LIKELY BUILD-APPLICABLE.</w:t>
+              <w:t>LIKELY 2017 BUILD-APPLICABLE EDITION; ADR 34/03 was made later in 2017.</w:t>
             </w:r>
           </w:p>
         </w:tc>
@@ -4094,6 +4094,222 @@
               <w:rPr>
                 <w:sz w:val="12"/>
               </w:rPr>
+              <w:t>42/04</w:t>
+            </w:r>
+          </w:p>
+        </w:tc>
+        <w:tc>
+          <w:tcPr>
+            <w:tcW w:type="dxa" w:w="2131"/>
+            <w:vAlign w:val="center"/>
+          </w:tcPr>
+          <w:p>
+            <w:r>
+              <w:rPr>
+                <w:sz w:val="12"/>
+              </w:rPr>
+              <w:t>General Safety Requirements</w:t>
+            </w:r>
+          </w:p>
+        </w:tc>
+        <w:tc>
+          <w:tcPr>
+            <w:tcW w:type="dxa" w:w="2131"/>
+            <w:vAlign w:val="center"/>
+          </w:tcPr>
+          <w:p>
+            <w:r>
+              <w:rPr>
+                <w:sz w:val="12"/>
+              </w:rPr>
+              <w:t>system-level/general</w:t>
+            </w:r>
+          </w:p>
+        </w:tc>
+        <w:tc>
+          <w:tcPr>
+            <w:tcW w:type="dxa" w:w="2131"/>
+            <w:vAlign w:val="center"/>
+          </w:tcPr>
+          <w:p>
+            <w:r>
+              <w:rPr>
+                <w:sz w:val="12"/>
+              </w:rPr>
+              <w:t>Interior fittings, controls, projections and general construction requirements</w:t>
+            </w:r>
+          </w:p>
+        </w:tc>
+        <w:tc>
+          <w:tcPr>
+            <w:tcW w:type="dxa" w:w="2131"/>
+            <w:vAlign w:val="center"/>
+          </w:tcPr>
+          <w:p>
+            <w:r>
+              <w:rPr>
+                <w:sz w:val="12"/>
+              </w:rPr>
+              <w:t>LIKELY BUILD-APPLICABLE.</w:t>
+            </w:r>
+          </w:p>
+        </w:tc>
+      </w:tr>
+      <w:tr>
+        <w:tc>
+          <w:tcPr>
+            <w:tcW w:type="dxa" w:w="2131"/>
+            <w:vAlign w:val="center"/>
+          </w:tcPr>
+          <w:p>
+            <w:r>
+              <w:rPr>
+                <w:sz w:val="12"/>
+              </w:rPr>
+              <w:t>69/00</w:t>
+            </w:r>
+          </w:p>
+        </w:tc>
+        <w:tc>
+          <w:tcPr>
+            <w:tcW w:type="dxa" w:w="2131"/>
+            <w:vAlign w:val="center"/>
+          </w:tcPr>
+          <w:p>
+            <w:r>
+              <w:rPr>
+                <w:sz w:val="12"/>
+              </w:rPr>
+              <w:t>Full Frontal Impact Occupant Protection</w:t>
+            </w:r>
+          </w:p>
+        </w:tc>
+        <w:tc>
+          <w:tcPr>
+            <w:tcW w:type="dxa" w:w="2131"/>
+            <w:vAlign w:val="center"/>
+          </w:tcPr>
+          <w:p>
+            <w:r>
+              <w:rPr>
+                <w:sz w:val="12"/>
+              </w:rPr>
+              <w:t>system-level</w:t>
+            </w:r>
+          </w:p>
+        </w:tc>
+        <w:tc>
+          <w:tcPr>
+            <w:tcW w:type="dxa" w:w="2131"/>
+            <w:vAlign w:val="center"/>
+          </w:tcPr>
+          <w:p>
+            <w:r>
+              <w:rPr>
+                <w:sz w:val="12"/>
+              </w:rPr>
+              <w:t>Airbags, belts/pretensioners, seats, steering column and sensors as a restraint system</w:t>
+            </w:r>
+          </w:p>
+        </w:tc>
+        <w:tc>
+          <w:tcPr>
+            <w:tcW w:type="dxa" w:w="2131"/>
+            <w:vAlign w:val="center"/>
+          </w:tcPr>
+          <w:p>
+            <w:r>
+              <w:rPr>
+                <w:sz w:val="12"/>
+              </w:rPr>
+              <w:t>LIKELY BUILD-APPLICABLE.</w:t>
+            </w:r>
+          </w:p>
+        </w:tc>
+      </w:tr>
+      <w:tr>
+        <w:tc>
+          <w:tcPr>
+            <w:tcW w:type="dxa" w:w="2131"/>
+            <w:vAlign w:val="center"/>
+          </w:tcPr>
+          <w:p>
+            <w:r>
+              <w:rPr>
+                <w:sz w:val="12"/>
+              </w:rPr>
+              <w:t>72/00</w:t>
+            </w:r>
+          </w:p>
+        </w:tc>
+        <w:tc>
+          <w:tcPr>
+            <w:tcW w:type="dxa" w:w="2131"/>
+            <w:vAlign w:val="center"/>
+          </w:tcPr>
+          <w:p>
+            <w:r>
+              <w:rPr>
+                <w:sz w:val="12"/>
+              </w:rPr>
+              <w:t>Dynamic Side Impact Occupant Protection</w:t>
+            </w:r>
+          </w:p>
+        </w:tc>
+        <w:tc>
+          <w:tcPr>
+            <w:tcW w:type="dxa" w:w="2131"/>
+            <w:vAlign w:val="center"/>
+          </w:tcPr>
+          <w:p>
+            <w:r>
+              <w:rPr>
+                <w:sz w:val="12"/>
+              </w:rPr>
+              <w:t>system-level</w:t>
+            </w:r>
+          </w:p>
+        </w:tc>
+        <w:tc>
+          <w:tcPr>
+            <w:tcW w:type="dxa" w:w="2131"/>
+            <w:vAlign w:val="center"/>
+          </w:tcPr>
+          <w:p>
+            <w:r>
+              <w:rPr>
+                <w:sz w:val="12"/>
+              </w:rPr>
+              <w:t>Side-curtain and seat-mounted airbags, seats, belts, door/side structure and sensors</w:t>
+            </w:r>
+          </w:p>
+        </w:tc>
+        <w:tc>
+          <w:tcPr>
+            <w:tcW w:type="dxa" w:w="2131"/>
+            <w:vAlign w:val="center"/>
+          </w:tcPr>
+          <w:p>
+            <w:r>
+              <w:rPr>
+                <w:sz w:val="12"/>
+              </w:rPr>
+              <w:t>LIKELY BUILD-APPLICABLE.</w:t>
+            </w:r>
+          </w:p>
+        </w:tc>
+      </w:tr>
+      <w:tr>
+        <w:tc>
+          <w:tcPr>
+            <w:tcW w:type="dxa" w:w="2131"/>
+            <w:vAlign w:val="center"/>
+          </w:tcPr>
+          <w:p>
+            <w:r>
+              <w:rPr>
+                <w:sz w:val="12"/>
+              </w:rPr>
               <w:t>73/00</w:t>
             </w:r>
           </w:p>
@@ -4151,6 +4367,78 @@
                 <w:sz w:val="12"/>
               </w:rPr>
               <w:t>POTENTIALLY BUILD-APPLICABLE; exact category/date/approval-pathway applicability requires confirmation.</w:t>
+            </w:r>
+          </w:p>
+        </w:tc>
+      </w:tr>
+      <w:tr>
+        <w:tc>
+          <w:tcPr>
+            <w:tcW w:type="dxa" w:w="2131"/>
+            <w:vAlign w:val="center"/>
+          </w:tcPr>
+          <w:p>
+            <w:r>
+              <w:rPr>
+                <w:sz w:val="12"/>
+              </w:rPr>
+              <w:t>85/00</w:t>
+            </w:r>
+          </w:p>
+        </w:tc>
+        <w:tc>
+          <w:tcPr>
+            <w:tcW w:type="dxa" w:w="2131"/>
+            <w:vAlign w:val="center"/>
+          </w:tcPr>
+          <w:p>
+            <w:r>
+              <w:rPr>
+                <w:sz w:val="12"/>
+              </w:rPr>
+              <w:t>Pole Side Impact Performance</w:t>
+            </w:r>
+          </w:p>
+        </w:tc>
+        <w:tc>
+          <w:tcPr>
+            <w:tcW w:type="dxa" w:w="2131"/>
+            <w:vAlign w:val="center"/>
+          </w:tcPr>
+          <w:p>
+            <w:r>
+              <w:rPr>
+                <w:sz w:val="12"/>
+              </w:rPr>
+              <w:t>system-level</w:t>
+            </w:r>
+          </w:p>
+        </w:tc>
+        <w:tc>
+          <w:tcPr>
+            <w:tcW w:type="dxa" w:w="2131"/>
+            <w:vAlign w:val="center"/>
+          </w:tcPr>
+          <w:p>
+            <w:r>
+              <w:rPr>
+                <w:sz w:val="12"/>
+              </w:rPr>
+              <w:t>Side-curtain and seat-mounted airbags, sensors and side structure</w:t>
+            </w:r>
+          </w:p>
+        </w:tc>
+        <w:tc>
+          <w:tcPr>
+            <w:tcW w:type="dxa" w:w="2131"/>
+            <w:vAlign w:val="center"/>
+          </w:tcPr>
+          <w:p>
+            <w:r>
+              <w:rPr>
+                <w:sz w:val="12"/>
+              </w:rPr>
+              <w:t>PROBABLY NOT MANDATORY for these 2017 vehicles; confirm exact build date and regulatory new-model history.</w:t>
             </w:r>
           </w:p>
         </w:tc>
@@ -4161,7 +4449,7 @@
         <w:pStyle w:val="Heading1"/>
       </w:pPr>
       <w:r>
-        <w:t>Common ADR-critical catalog candidates</w:t>
+        <w:t>Common direct-safety hardware catalog candidates</w:t>
       </w:r>
     </w:p>
     <w:tbl>
@@ -4264,7 +4552,7 @@
               <w:rPr>
                 <w:sz w:val="12"/>
               </w:rPr>
-              <w:t>5LB70DX9AH</w:t>
+              <w:t>5057792AH</w:t>
             </w:r>
           </w:p>
         </w:tc>
@@ -4278,7 +4566,7 @@
               <w:rPr>
                 <w:sz w:val="12"/>
               </w:rPr>
-              <w:t>Module | Steering Column Module</w:t>
+              <w:t>Kneeblocker</w:t>
             </w:r>
           </w:p>
         </w:tc>
@@ -4292,7 +4580,7 @@
               <w:rPr>
                 <w:sz w:val="12"/>
               </w:rPr>
-              <w:t>Module | Steering Column Module</w:t>
+              <w:t>Kneeblocker</w:t>
             </w:r>
           </w:p>
         </w:tc>
@@ -4322,7 +4610,7 @@
               <w:rPr>
                 <w:sz w:val="12"/>
               </w:rPr>
-              <w:t>5LB71DX9AI</w:t>
+              <w:t>56054085AA</w:t>
             </w:r>
           </w:p>
         </w:tc>
@@ -4336,7 +4624,7 @@
               <w:rPr>
                 <w:sz w:val="12"/>
               </w:rPr>
-              <w:t>Module | Steering Column Module</w:t>
+              <w:t>Acceleration Sensor | Front</w:t>
             </w:r>
           </w:p>
         </w:tc>
@@ -4350,7 +4638,7 @@
               <w:rPr>
                 <w:sz w:val="12"/>
               </w:rPr>
-              <w:t>Module | Steering Column Module</w:t>
+              <w:t>Acceleration Sensor | Sensor</w:t>
             </w:r>
           </w:p>
         </w:tc>
@@ -4380,7 +4668,7 @@
               <w:rPr>
                 <w:sz w:val="12"/>
               </w:rPr>
-              <w:t>5LB72DX9AH</w:t>
+              <w:t>5LB70DX9AH</w:t>
             </w:r>
           </w:p>
         </w:tc>
@@ -4408,7 +4696,7 @@
               <w:rPr>
                 <w:sz w:val="12"/>
               </w:rPr>
-              <w:t>Module | Steering Column Module</w:t>
+              <w:t>Steering Column Module</w:t>
             </w:r>
           </w:p>
         </w:tc>
@@ -4438,7 +4726,7 @@
               <w:rPr>
                 <w:sz w:val="12"/>
               </w:rPr>
-              <w:t>6102132AA</w:t>
+              <w:t>5LB71DX9AI</w:t>
             </w:r>
           </w:p>
         </w:tc>
@@ -4452,7 +4740,7 @@
               <w:rPr>
                 <w:sz w:val="12"/>
               </w:rPr>
-              <w:t>Hex Head Screw | Screw</w:t>
+              <w:t>Module | Steering Column Module</w:t>
             </w:r>
           </w:p>
         </w:tc>
@@ -4466,7 +4754,7 @@
               <w:rPr>
                 <w:sz w:val="12"/>
               </w:rPr>
-              <w:t>Hex Head Screw | Screw</w:t>
+              <w:t>Module | Steering Column Module</w:t>
             </w:r>
           </w:p>
         </w:tc>
@@ -4496,7 +4784,7 @@
               <w:rPr>
                 <w:sz w:val="12"/>
               </w:rPr>
-              <w:t>6104725AA</w:t>
+              <w:t>5LB72DX9AH</w:t>
             </w:r>
           </w:p>
         </w:tc>
@@ -4510,7 +4798,7 @@
               <w:rPr>
                 <w:sz w:val="12"/>
               </w:rPr>
-              <w:t>Hex Nut | Washer</w:t>
+              <w:t>Module | Steering Column Module</w:t>
             </w:r>
           </w:p>
         </w:tc>
@@ -4524,7 +4812,7 @@
               <w:rPr>
                 <w:sz w:val="12"/>
               </w:rPr>
-              <w:t>Hex Nut | Washer</w:t>
+              <w:t>Module | Steering Column Module</w:t>
             </w:r>
           </w:p>
         </w:tc>
@@ -4554,7 +4842,7 @@
               <w:rPr>
                 <w:sz w:val="12"/>
               </w:rPr>
-              <w:t>6510026AA</w:t>
+              <w:t>6102132AA</w:t>
             </w:r>
           </w:p>
         </w:tc>
@@ -4568,7 +4856,7 @@
               <w:rPr>
                 <w:sz w:val="12"/>
               </w:rPr>
-              <w:t>Screw</w:t>
+              <w:t>Hex Head Screw | Screw</w:t>
             </w:r>
           </w:p>
         </w:tc>
@@ -4582,7 +4870,7 @@
               <w:rPr>
                 <w:sz w:val="12"/>
               </w:rPr>
-              <w:t>Screw</w:t>
+              <w:t>Hex Head Screw | Screw</w:t>
             </w:r>
           </w:p>
         </w:tc>
@@ -4598,7 +4886,7 @@
               <w:rPr>
                 <w:sz w:val="12"/>
               </w:rPr>
-              <w:t>front-seat-adjusters</w:t>
+              <w:t>air-bags</w:t>
             </w:r>
           </w:p>
         </w:tc>
@@ -4612,7 +4900,7 @@
               <w:rPr>
                 <w:sz w:val="12"/>
               </w:rPr>
-              <w:t>1UV50DX9AA</w:t>
+              <w:t>6104725AA</w:t>
             </w:r>
           </w:p>
         </w:tc>
@@ -4626,7 +4914,7 @@
               <w:rPr>
                 <w:sz w:val="12"/>
               </w:rPr>
-              <w:t>Cover | Track Cover</w:t>
+              <w:t>Hex Nut | Washer</w:t>
             </w:r>
           </w:p>
         </w:tc>
@@ -4640,7 +4928,7 @@
               <w:rPr>
                 <w:sz w:val="12"/>
               </w:rPr>
-              <w:t>Rear | Track Cover</w:t>
+              <w:t>Hex Nut | Washer</w:t>
             </w:r>
           </w:p>
         </w:tc>
@@ -4656,7 +4944,7 @@
               <w:rPr>
                 <w:sz w:val="12"/>
               </w:rPr>
-              <w:t>front-seat-adjusters</w:t>
+              <w:t>air-bags</w:t>
             </w:r>
           </w:p>
         </w:tc>
@@ -4670,7 +4958,7 @@
               <w:rPr>
                 <w:sz w:val="12"/>
               </w:rPr>
-              <w:t>1UV51DX9AA</w:t>
+              <w:t>6510026AA</w:t>
             </w:r>
           </w:p>
         </w:tc>
@@ -4684,7 +4972,7 @@
               <w:rPr>
                 <w:sz w:val="12"/>
               </w:rPr>
-              <w:t>Cover | Track Cover</w:t>
+              <w:t>Screw</w:t>
             </w:r>
           </w:p>
         </w:tc>
@@ -4698,7 +4986,7 @@
               <w:rPr>
                 <w:sz w:val="12"/>
               </w:rPr>
-              <w:t>Front | Track Cover</w:t>
+              <w:t>Screw</w:t>
             </w:r>
           </w:p>
         </w:tc>
@@ -4714,7 +5002,7 @@
               <w:rPr>
                 <w:sz w:val="12"/>
               </w:rPr>
-              <w:t>front-seat-adjusters</w:t>
+              <w:t>air-bags</w:t>
             </w:r>
           </w:p>
         </w:tc>
@@ -4728,7 +5016,7 @@
               <w:rPr>
                 <w:sz w:val="12"/>
               </w:rPr>
-              <w:t>1UV72DX9AA</w:t>
+              <w:t>68282914AD</w:t>
             </w:r>
           </w:p>
         </w:tc>
@@ -4742,7 +5030,7 @@
               <w:rPr>
                 <w:sz w:val="12"/>
               </w:rPr>
-              <w:t>Handle | Recliner Handle</w:t>
+              <w:t>Bag</w:t>
             </w:r>
           </w:p>
         </w:tc>
@@ -4756,7 +5044,7 @@
               <w:rPr>
                 <w:sz w:val="12"/>
               </w:rPr>
-              <w:t>Handle | Recliner Handle</w:t>
+              <w:t>Bag</w:t>
             </w:r>
           </w:p>
         </w:tc>
@@ -4786,7 +5074,7 @@
               <w:rPr>
                 <w:sz w:val="12"/>
               </w:rPr>
-              <w:t>1UV75DX9AB</w:t>
+              <w:t>1UY33DX9AC</w:t>
             </w:r>
           </w:p>
         </w:tc>
@@ -4800,7 +5088,7 @@
               <w:rPr>
                 <w:sz w:val="12"/>
               </w:rPr>
-              <w:t>Cover | Front Seat Anchor Bolt Cover</w:t>
+              <w:t>2011-2020 Mopar Seat Adjuster Shield | Shield</w:t>
             </w:r>
           </w:p>
         </w:tc>
@@ -4814,7 +5102,7 @@
               <w:rPr>
                 <w:sz w:val="12"/>
               </w:rPr>
-              <w:t>Cover | Front Seat Anchor Bolt Cover</w:t>
+              <w:t>2011-2020 Mopar Seat Adjuster Shield | Shield</w:t>
             </w:r>
           </w:p>
         </w:tc>
@@ -4844,7 +5132,7 @@
               <w:rPr>
                 <w:sz w:val="12"/>
               </w:rPr>
-              <w:t>1UW25DX9AB</w:t>
+              <w:t>1UZ62DX9AC</w:t>
             </w:r>
           </w:p>
         </w:tc>
@@ -4858,7 +5146,7 @@
               <w:rPr>
                 <w:sz w:val="12"/>
               </w:rPr>
-              <w:t>Cover | Front Seat Anchor Bolt Cover, Left</w:t>
+              <w:t>2011-2021 Mopar Seat Adjuster Shield | Shield</w:t>
             </w:r>
           </w:p>
         </w:tc>
@@ -4872,7 +5160,7 @@
               <w:rPr>
                 <w:sz w:val="12"/>
               </w:rPr>
-              <w:t>Cover | Front Seat Anchor Bolt Cover, Left</w:t>
+              <w:t>2011-2021 Mopar Seat Adjuster Shield | Shield</w:t>
             </w:r>
           </w:p>
         </w:tc>
@@ -4902,7 +5190,7 @@
               <w:rPr>
                 <w:sz w:val="12"/>
               </w:rPr>
-              <w:t>1UY02DX9AC</w:t>
+              <w:t>68102980AA</w:t>
             </w:r>
           </w:p>
         </w:tc>
@@ -4916,7 +5204,7 @@
               <w:rPr>
                 <w:sz w:val="12"/>
               </w:rPr>
-              <w:t>2011-2021 Mopar Front Seat Back Panel | Panel</w:t>
+              <w:t>Airbag Chute | Chute</w:t>
             </w:r>
           </w:p>
         </w:tc>
@@ -4930,7 +5218,7 @@
               <w:rPr>
                 <w:sz w:val="12"/>
               </w:rPr>
-              <w:t>2011-2021 Mopar Front Seat Back Panel | Panel</w:t>
+              <w:t>Airbag Chute</w:t>
             </w:r>
           </w:p>
         </w:tc>
@@ -4960,7 +5248,7 @@
               <w:rPr>
                 <w:sz w:val="12"/>
               </w:rPr>
-              <w:t>1UY08DX9AB</w:t>
+              <w:t>68103691AA</w:t>
             </w:r>
           </w:p>
         </w:tc>
@@ -4974,7 +5262,7 @@
               <w:rPr>
                 <w:sz w:val="12"/>
               </w:rPr>
-              <w:t>Seat Shield | Shield</w:t>
+              <w:t>Airbag Chute | Chute</w:t>
             </w:r>
           </w:p>
         </w:tc>
@@ -4988,7 +5276,7 @@
               <w:rPr>
                 <w:sz w:val="12"/>
               </w:rPr>
-              <w:t>Seat Shield | Shield</w:t>
+              <w:t>Airbag Chute</w:t>
             </w:r>
           </w:p>
         </w:tc>
@@ -5018,7 +5306,7 @@
               <w:rPr>
                 <w:sz w:val="12"/>
               </w:rPr>
-              <w:t>1UY33DX9AC</w:t>
+              <w:t>68103696AA</w:t>
             </w:r>
           </w:p>
         </w:tc>
@@ -5032,7 +5320,7 @@
               <w:rPr>
                 <w:sz w:val="12"/>
               </w:rPr>
-              <w:t>2011-2020 Mopar Seat Adjuster Shield | Shield</w:t>
+              <w:t>Frame | Front Seat Back Frame</w:t>
             </w:r>
           </w:p>
         </w:tc>
@@ -5046,7 +5334,7 @@
               <w:rPr>
                 <w:sz w:val="12"/>
               </w:rPr>
-              <w:t>2011-2020 Mopar Seat Adjuster Shield | Shield</w:t>
+              <w:t>Frame | Front Seat Back Frame</w:t>
             </w:r>
           </w:p>
         </w:tc>
@@ -5076,7 +5364,7 @@
               <w:rPr>
                 <w:sz w:val="12"/>
               </w:rPr>
-              <w:t>1UZ62DX9AC</w:t>
+              <w:t>68104427AA</w:t>
             </w:r>
           </w:p>
         </w:tc>
@@ -5090,7 +5378,7 @@
               <w:rPr>
                 <w:sz w:val="12"/>
               </w:rPr>
-              <w:t>2011-2021 Mopar Seat Adjuster Shield | Shield</w:t>
+              <w:t>Frame | Front Seat Back Frame</w:t>
             </w:r>
           </w:p>
         </w:tc>
@@ -5104,7 +5392,7 @@
               <w:rPr>
                 <w:sz w:val="12"/>
               </w:rPr>
-              <w:t>2011-2021 Mopar Seat Adjuster Shield | Shield</w:t>
+              <w:t>Frame | Front Seat Back Frame</w:t>
             </w:r>
           </w:p>
         </w:tc>
@@ -5134,7 +5422,7 @@
               <w:rPr>
                 <w:sz w:val="12"/>
               </w:rPr>
-              <w:t>55057389AD</w:t>
+              <w:t>68104489AA</w:t>
             </w:r>
           </w:p>
         </w:tc>
@@ -5148,7 +5436,7 @@
               <w:rPr>
                 <w:sz w:val="12"/>
               </w:rPr>
-              <w:t>Blower | Seat Back Blower</w:t>
+              <w:t>Frame | Front Seat Back Frame</w:t>
             </w:r>
           </w:p>
         </w:tc>
@@ -5162,7 +5450,7 @@
               <w:rPr>
                 <w:sz w:val="12"/>
               </w:rPr>
-              <w:t>Blower | Seat Back Blower</w:t>
+              <w:t>Frame | Front Seat Back Frame</w:t>
             </w:r>
           </w:p>
         </w:tc>
@@ -5192,7 +5480,7 @@
               <w:rPr>
                 <w:sz w:val="12"/>
               </w:rPr>
-              <w:t>6507594AA</w:t>
+              <w:t>68157098AA</w:t>
             </w:r>
           </w:p>
         </w:tc>
@@ -5206,7 +5494,7 @@
               <w:rPr>
                 <w:sz w:val="12"/>
               </w:rPr>
-              <w:t>Hex Head Screw | Screw</w:t>
+              <w:t>Bracket | Seat Bracket</w:t>
             </w:r>
           </w:p>
         </w:tc>
@@ -5220,7 +5508,7 @@
               <w:rPr>
                 <w:sz w:val="12"/>
               </w:rPr>
-              <w:t>Hex Head Screw</w:t>
+              <w:t>Bracket | Seat Bracket</w:t>
             </w:r>
           </w:p>
         </w:tc>
@@ -5250,7 +5538,7 @@
               <w:rPr>
                 <w:sz w:val="12"/>
               </w:rPr>
-              <w:t>68102980AA</w:t>
+              <w:t>68157292AA</w:t>
             </w:r>
           </w:p>
         </w:tc>
@@ -5264,7 +5552,7 @@
               <w:rPr>
                 <w:sz w:val="12"/>
               </w:rPr>
-              <w:t>Airbag Chute | Chute</w:t>
+              <w:t>Front | Seat Bracket</w:t>
             </w:r>
           </w:p>
         </w:tc>
@@ -5278,7 +5566,7 @@
               <w:rPr>
                 <w:sz w:val="12"/>
               </w:rPr>
-              <w:t>Airbag Chute</w:t>
+              <w:t>Bracket | Seat Bracket</w:t>
             </w:r>
           </w:p>
         </w:tc>
@@ -5308,7 +5596,7 @@
               <w:rPr>
                 <w:sz w:val="12"/>
               </w:rPr>
-              <w:t>68103691AA</w:t>
+              <w:t>68157294AA</w:t>
             </w:r>
           </w:p>
         </w:tc>
@@ -5322,7 +5610,7 @@
               <w:rPr>
                 <w:sz w:val="12"/>
               </w:rPr>
-              <w:t>Airbag Chute | Chute</w:t>
+              <w:t>Rear | Seat Bracket</w:t>
             </w:r>
           </w:p>
         </w:tc>
@@ -5336,7 +5624,7 @@
               <w:rPr>
                 <w:sz w:val="12"/>
               </w:rPr>
-              <w:t>Airbag Chute</w:t>
+              <w:t>Bracket | Seat Bracket</w:t>
             </w:r>
           </w:p>
         </w:tc>
@@ -5366,7 +5654,7 @@
               <w:rPr>
                 <w:sz w:val="12"/>
               </w:rPr>
-              <w:t>68103696AA</w:t>
+              <w:t>68159137AA</w:t>
             </w:r>
           </w:p>
         </w:tc>
@@ -5424,7 +5712,7 @@
               <w:rPr>
                 <w:sz w:val="12"/>
               </w:rPr>
-              <w:t>68104427AA</w:t>
+              <w:t>68159139AA</w:t>
             </w:r>
           </w:p>
         </w:tc>
@@ -5482,7 +5770,7 @@
               <w:rPr>
                 <w:sz w:val="12"/>
               </w:rPr>
-              <w:t>68104489AA</w:t>
+              <w:t>68159141AA</w:t>
             </w:r>
           </w:p>
         </w:tc>
@@ -5496,7 +5784,7 @@
               <w:rPr>
                 <w:sz w:val="12"/>
               </w:rPr>
-              <w:t>Frame | Front Seat Back Frame</w:t>
+              <w:t>Bracket | Seat Bracket</w:t>
             </w:r>
           </w:p>
         </w:tc>
@@ -5510,7 +5798,7 @@
               <w:rPr>
                 <w:sz w:val="12"/>
               </w:rPr>
-              <w:t>Frame | Front Seat Back Frame</w:t>
+              <w:t>Bracket | Seat Bracket</w:t>
             </w:r>
           </w:p>
         </w:tc>
@@ -5540,7 +5828,7 @@
               <w:rPr>
                 <w:sz w:val="12"/>
               </w:rPr>
-              <w:t>68157098AA</w:t>
+              <w:t>68193458AC</w:t>
             </w:r>
           </w:p>
         </w:tc>
@@ -5554,7 +5842,7 @@
               <w:rPr>
                 <w:sz w:val="12"/>
               </w:rPr>
-              <w:t>Bracket | Seat Bracket</w:t>
+              <w:t>2013-2021 Mopar Manual Seat Adjuster | Adjuster</w:t>
             </w:r>
           </w:p>
         </w:tc>
@@ -5568,7 +5856,7 @@
               <w:rPr>
                 <w:sz w:val="12"/>
               </w:rPr>
-              <w:t>Bracket | Seat Bracket</w:t>
+              <w:t>2013-2021 Mopar Manual Seat Adjuster | Adjuster</w:t>
             </w:r>
           </w:p>
         </w:tc>
@@ -5598,7 +5886,7 @@
               <w:rPr>
                 <w:sz w:val="12"/>
               </w:rPr>
-              <w:t>68157292AA</w:t>
+              <w:t>68193460AC</w:t>
             </w:r>
           </w:p>
         </w:tc>
@@ -5612,7 +5900,7 @@
               <w:rPr>
                 <w:sz w:val="12"/>
               </w:rPr>
-              <w:t>Front | Seat Bracket</w:t>
+              <w:t>Adjuster | Power Seat Adjuster</w:t>
             </w:r>
           </w:p>
         </w:tc>
@@ -5626,7 +5914,7 @@
               <w:rPr>
                 <w:sz w:val="12"/>
               </w:rPr>
-              <w:t>Bracket | Seat Bracket</w:t>
+              <w:t>Adjuster | Power Seat Adjuster</w:t>
             </w:r>
           </w:p>
         </w:tc>
@@ -5656,7 +5944,7 @@
               <w:rPr>
                 <w:sz w:val="12"/>
               </w:rPr>
-              <w:t>68157294AA</w:t>
+              <w:t>68193462AC</w:t>
             </w:r>
           </w:p>
         </w:tc>
@@ -5670,7 +5958,7 @@
               <w:rPr>
                 <w:sz w:val="12"/>
               </w:rPr>
-              <w:t>Rear | Seat Bracket</w:t>
+              <w:t>2013-2020 Mopar Power Seat Adjuster | Adjuster</w:t>
             </w:r>
           </w:p>
         </w:tc>
@@ -5684,7 +5972,7 @@
               <w:rPr>
                 <w:sz w:val="12"/>
               </w:rPr>
-              <w:t>Bracket | Seat Bracket</w:t>
+              <w:t>2013-2020 Mopar Power Seat Adjuster | Adjuster</w:t>
             </w:r>
           </w:p>
         </w:tc>
@@ -5714,7 +6002,7 @@
               <w:rPr>
                 <w:sz w:val="12"/>
               </w:rPr>
-              <w:t>68159137AA</w:t>
+              <w:t>68264615AB</w:t>
             </w:r>
           </w:p>
         </w:tc>
@@ -5728,7 +6016,7 @@
               <w:rPr>
                 <w:sz w:val="12"/>
               </w:rPr>
-              <w:t>Frame | Front Seat Back Frame</w:t>
+              <w:t>Adjuster | Power Seat Adjuster</w:t>
             </w:r>
           </w:p>
         </w:tc>
@@ -5742,7 +6030,7 @@
               <w:rPr>
                 <w:sz w:val="12"/>
               </w:rPr>
-              <w:t>Frame | Front Seat Back Frame</w:t>
+              <w:t>Adjuster | Power Seat Adjuster</w:t>
             </w:r>
           </w:p>
         </w:tc>
@@ -5772,7 +6060,7 @@
               <w:rPr>
                 <w:sz w:val="12"/>
               </w:rPr>
-              <w:t>68159139AA</w:t>
+              <w:t>68264619AB</w:t>
             </w:r>
           </w:p>
         </w:tc>
@@ -5786,7 +6074,7 @@
               <w:rPr>
                 <w:sz w:val="12"/>
               </w:rPr>
-              <w:t>Frame | Front Seat Back Frame</w:t>
+              <w:t>2015-2021 Mopar Power Seat Adjuster | Adjuster</w:t>
             </w:r>
           </w:p>
         </w:tc>
@@ -5800,7 +6088,7 @@
               <w:rPr>
                 <w:sz w:val="12"/>
               </w:rPr>
-              <w:t>Frame | Front Seat Back Frame</w:t>
+              <w:t>2015-2021 Mopar Power Seat Adjuster | Adjuster</w:t>
             </w:r>
           </w:p>
         </w:tc>
@@ -5816,7 +6104,7 @@
               <w:rPr>
                 <w:sz w:val="12"/>
               </w:rPr>
-              <w:t>front-seat-adjusters</w:t>
+              <w:t>instrument-panel</w:t>
             </w:r>
           </w:p>
         </w:tc>
@@ -5830,7 +6118,7 @@
               <w:rPr>
                 <w:sz w:val="12"/>
               </w:rPr>
-              <w:t>68159141AA</w:t>
+              <w:t>1JN63DX9AF</w:t>
             </w:r>
           </w:p>
         </w:tc>
@@ -5844,7 +6132,7 @@
               <w:rPr>
                 <w:sz w:val="12"/>
               </w:rPr>
-              <w:t>Bracket | Seat Bracket</w:t>
+              <w:t>2011-2021 Mopar Steering Column Opening Kneeblocker | Kneeblocker</w:t>
             </w:r>
           </w:p>
         </w:tc>
@@ -5858,7 +6146,7 @@
               <w:rPr>
                 <w:sz w:val="12"/>
               </w:rPr>
-              <w:t>Bracket | Seat Bracket</w:t>
+              <w:t>2011-2021 Mopar Steering Column Opening Kneeblocker | Kneeblocker</w:t>
             </w:r>
           </w:p>
         </w:tc>
@@ -5874,7 +6162,7 @@
               <w:rPr>
                 <w:sz w:val="12"/>
               </w:rPr>
-              <w:t>front-seat-adjusters</w:t>
+              <w:t>instrument-panel</w:t>
             </w:r>
           </w:p>
         </w:tc>
@@ -5888,7 +6176,7 @@
               <w:rPr>
                 <w:sz w:val="12"/>
               </w:rPr>
-              <w:t>68193458AC</w:t>
+              <w:t>68346615AC</w:t>
             </w:r>
           </w:p>
         </w:tc>
@@ -5902,7 +6190,7 @@
               <w:rPr>
                 <w:sz w:val="12"/>
               </w:rPr>
-              <w:t>2013-2021 Mopar Manual Seat Adjuster | Adjuster</w:t>
+              <w:t>Instrument Panel Reinforcement | Reinforcement</w:t>
             </w:r>
           </w:p>
         </w:tc>
@@ -5916,7 +6204,7 @@
               <w:rPr>
                 <w:sz w:val="12"/>
               </w:rPr>
-              <w:t>2013-2021 Mopar Manual Seat Adjuster | Adjuster</w:t>
+              <w:t>Instrument Panel Reinforcement</w:t>
             </w:r>
           </w:p>
         </w:tc>
@@ -5932,7 +6220,7 @@
               <w:rPr>
                 <w:sz w:val="12"/>
               </w:rPr>
-              <w:t>front-seat-adjusters</w:t>
+              <w:t>rear-seats-second-row</w:t>
             </w:r>
           </w:p>
         </w:tc>
@@ -5946,7 +6234,7 @@
               <w:rPr>
                 <w:sz w:val="12"/>
               </w:rPr>
-              <w:t>68193460AC</w:t>
+              <w:t>1DL16DX9AA</w:t>
             </w:r>
           </w:p>
         </w:tc>
@@ -5960,7 +6248,7 @@
               <w:rPr>
                 <w:sz w:val="12"/>
               </w:rPr>
-              <w:t>Adjuster | Power Seat Adjuster</w:t>
+              <w:t>Headrest Sleeve, Locking | Locking</w:t>
             </w:r>
           </w:p>
         </w:tc>
@@ -5974,7 +6262,7 @@
               <w:rPr>
                 <w:sz w:val="12"/>
               </w:rPr>
-              <w:t>Adjuster | Power Seat Adjuster</w:t>
+              <w:t>Headrest Sleeve, Locking | Locking</w:t>
             </w:r>
           </w:p>
         </w:tc>
@@ -5990,7 +6278,7 @@
               <w:rPr>
                 <w:sz w:val="12"/>
               </w:rPr>
-              <w:t>front-seat-adjusters</w:t>
+              <w:t>rear-seats-second-row</w:t>
             </w:r>
           </w:p>
         </w:tc>
@@ -6004,7 +6292,7 @@
               <w:rPr>
                 <w:sz w:val="12"/>
               </w:rPr>
-              <w:t>68193462AC</w:t>
+              <w:t>1UY04DX9AB</w:t>
             </w:r>
           </w:p>
         </w:tc>
@@ -6018,7 +6306,7 @@
               <w:rPr>
                 <w:sz w:val="12"/>
               </w:rPr>
-              <w:t>2013-2020 Mopar Power Seat Adjuster | Adjuster</w:t>
+              <w:t>Headrest Sleeve, Non-Locking | Non-locking</w:t>
             </w:r>
           </w:p>
         </w:tc>
@@ -6032,7 +6320,7 @@
               <w:rPr>
                 <w:sz w:val="12"/>
               </w:rPr>
-              <w:t>2013-2020 Mopar Power Seat Adjuster | Adjuster</w:t>
+              <w:t>Headrest Sleeve, Non-Locking | Non-locking</w:t>
             </w:r>
           </w:p>
         </w:tc>
@@ -6048,7 +6336,7 @@
               <w:rPr>
                 <w:sz w:val="12"/>
               </w:rPr>
-              <w:t>front-seat-adjusters</w:t>
+              <w:t>rear-seats-second-row</w:t>
             </w:r>
           </w:p>
         </w:tc>
@@ -6062,7 +6350,7 @@
               <w:rPr>
                 <w:sz w:val="12"/>
               </w:rPr>
-              <w:t>68264615AB</w:t>
+              <w:t>5YA39DX9AA</w:t>
             </w:r>
           </w:p>
         </w:tc>
@@ -6076,7 +6364,7 @@
               <w:rPr>
                 <w:sz w:val="12"/>
               </w:rPr>
-              <w:t>Adjuster | Power Seat Adjuster</w:t>
+              <w:t>Headrest | Rear Headrest</w:t>
             </w:r>
           </w:p>
         </w:tc>
@@ -6090,7 +6378,7 @@
               <w:rPr>
                 <w:sz w:val="12"/>
               </w:rPr>
-              <w:t>Adjuster | Power Seat Adjuster</w:t>
+              <w:t>Headrest | Rear Headrest</w:t>
             </w:r>
           </w:p>
         </w:tc>
@@ -6106,7 +6394,7 @@
               <w:rPr>
                 <w:sz w:val="12"/>
               </w:rPr>
-              <w:t>front-seat-adjusters</w:t>
+              <w:t>rear-seats-second-row</w:t>
             </w:r>
           </w:p>
         </w:tc>
@@ -6120,7 +6408,7 @@
               <w:rPr>
                 <w:sz w:val="12"/>
               </w:rPr>
-              <w:t>68264619AB</w:t>
+              <w:t>68159129AA</w:t>
             </w:r>
           </w:p>
         </w:tc>
@@ -6134,7 +6422,7 @@
               <w:rPr>
                 <w:sz w:val="12"/>
               </w:rPr>
-              <w:t>2015-2021 Mopar Power Seat Adjuster | Adjuster</w:t>
+              <w:t>Frame | Rear Seat Cushion Frame</w:t>
             </w:r>
           </w:p>
         </w:tc>
@@ -6148,7 +6436,7 @@
               <w:rPr>
                 <w:sz w:val="12"/>
               </w:rPr>
-              <w:t>2015-2021 Mopar Power Seat Adjuster | Adjuster</w:t>
+              <w:t>Frame | Rear Seat Cushion Frame</w:t>
             </w:r>
           </w:p>
         </w:tc>
@@ -6164,7 +6452,7 @@
               <w:rPr>
                 <w:sz w:val="12"/>
               </w:rPr>
-              <w:t>front-seat-adjusters</w:t>
+              <w:t>seat-belts</w:t>
             </w:r>
           </w:p>
         </w:tc>
@@ -6178,7 +6466,7 @@
               <w:rPr>
                 <w:sz w:val="12"/>
               </w:rPr>
-              <w:t>68306763AA</w:t>
+              <w:t>1HZ05DX9AI</w:t>
             </w:r>
           </w:p>
         </w:tc>
@@ -6192,7 +6480,7 @@
               <w:rPr>
                 <w:sz w:val="12"/>
               </w:rPr>
-              <w:t>Blower | Seat Cushion Blower</w:t>
+              <w:t>Left</w:t>
             </w:r>
           </w:p>
         </w:tc>
@@ -6206,7 +6494,7 @@
               <w:rPr>
                 <w:sz w:val="12"/>
               </w:rPr>
-              <w:t>Blower | Seat Cushion Blower</w:t>
+              <w:t>Left</w:t>
             </w:r>
           </w:p>
         </w:tc>
@@ -6222,7 +6510,7 @@
               <w:rPr>
                 <w:sz w:val="12"/>
               </w:rPr>
-              <w:t>instrument-panel</w:t>
+              <w:t>seat-belts</w:t>
             </w:r>
           </w:p>
         </w:tc>
@@ -6236,7 +6524,7 @@
               <w:rPr>
                 <w:sz w:val="12"/>
               </w:rPr>
-              <w:t>1JN63DX9AF</w:t>
+              <w:t>1HZ06DX9AI</w:t>
             </w:r>
           </w:p>
         </w:tc>
@@ -6250,7 +6538,7 @@
               <w:rPr>
                 <w:sz w:val="12"/>
               </w:rPr>
-              <w:t>2011-2021 Mopar Steering Column Opening Kneeblocker | Kneeblocker</w:t>
+              <w:t>Front Outer Seat Belt, Right | Right</w:t>
             </w:r>
           </w:p>
         </w:tc>
@@ -6264,7 +6552,7 @@
               <w:rPr>
                 <w:sz w:val="12"/>
               </w:rPr>
-              <w:t>2011-2021 Mopar Steering Column Opening Kneeblocker | Kneeblocker</w:t>
+              <w:t>Front Outer Seat Belt, Right | Right</w:t>
             </w:r>
           </w:p>
         </w:tc>
@@ -6280,7 +6568,7 @@
               <w:rPr>
                 <w:sz w:val="12"/>
               </w:rPr>
-              <w:t>rear-seats-second-row</w:t>
+              <w:t>seat-belts</w:t>
             </w:r>
           </w:p>
         </w:tc>
@@ -6294,7 +6582,7 @@
               <w:rPr>
                 <w:sz w:val="12"/>
               </w:rPr>
-              <w:t>1DL16DX9AA</w:t>
+              <w:t>5135197AA</w:t>
             </w:r>
           </w:p>
         </w:tc>
@@ -6308,7 +6596,7 @@
               <w:rPr>
                 <w:sz w:val="12"/>
               </w:rPr>
-              <w:t>Headrest Sleeve, Locking | Locking</w:t>
+              <w:t>Seat Belt Extender</w:t>
             </w:r>
           </w:p>
         </w:tc>
@@ -6322,7 +6610,7 @@
               <w:rPr>
                 <w:sz w:val="12"/>
               </w:rPr>
-              <w:t>Headrest Sleeve, Locking | Locking</w:t>
+              <w:t>Seat Belt Extender</w:t>
             </w:r>
           </w:p>
         </w:tc>
@@ -6338,7 +6626,7 @@
               <w:rPr>
                 <w:sz w:val="12"/>
               </w:rPr>
-              <w:t>rear-seats-second-row</w:t>
+              <w:t>seat-belts</w:t>
             </w:r>
           </w:p>
         </w:tc>
@@ -6352,7 +6640,7 @@
               <w:rPr>
                 <w:sz w:val="12"/>
               </w:rPr>
-              <w:t>1UY04DX9AB</w:t>
+              <w:t>6105124AA</w:t>
             </w:r>
           </w:p>
         </w:tc>
@@ -6366,7 +6654,7 @@
               <w:rPr>
                 <w:sz w:val="12"/>
               </w:rPr>
-              <w:t>Headrest Sleeve, Non-Locking | Non-locking</w:t>
+              <w:t>Pan Head Screw</w:t>
             </w:r>
           </w:p>
         </w:tc>
@@ -6380,7 +6668,7 @@
               <w:rPr>
                 <w:sz w:val="12"/>
               </w:rPr>
-              <w:t>Headrest Sleeve, Non-Locking | Non-locking</w:t>
+              <w:t>Pan Head Screw</w:t>
             </w:r>
           </w:p>
         </w:tc>
@@ -6396,7 +6684,7 @@
               <w:rPr>
                 <w:sz w:val="12"/>
               </w:rPr>
-              <w:t>rear-seats-second-row</w:t>
+              <w:t>seat-belts</w:t>
             </w:r>
           </w:p>
         </w:tc>
@@ -6410,7 +6698,7 @@
               <w:rPr>
                 <w:sz w:val="12"/>
               </w:rPr>
-              <w:t>5SB021V5AB</w:t>
+              <w:t>6502724</w:t>
             </w:r>
           </w:p>
         </w:tc>
@@ -6424,7 +6712,7 @@
               <w:rPr>
                 <w:sz w:val="12"/>
               </w:rPr>
-              <w:t>Seat Bolster, Right</w:t>
+              <w:t>Hex Flange Nut | Nut</w:t>
             </w:r>
           </w:p>
         </w:tc>
@@ -6438,7 +6726,7 @@
               <w:rPr>
                 <w:sz w:val="12"/>
               </w:rPr>
-              <w:t>Right | Seat Bolster, Right</w:t>
+              <w:t>Hex Flange Nut | Nut</w:t>
             </w:r>
           </w:p>
         </w:tc>
@@ -6454,7 +6742,7 @@
               <w:rPr>
                 <w:sz w:val="12"/>
               </w:rPr>
-              <w:t>rear-seats-second-row</w:t>
+              <w:t>seat-belts</w:t>
             </w:r>
           </w:p>
         </w:tc>
@@ -6468,7 +6756,7 @@
               <w:rPr>
                 <w:sz w:val="12"/>
               </w:rPr>
-              <w:t>5SB031V5AB</w:t>
+              <w:t>6504537</w:t>
             </w:r>
           </w:p>
         </w:tc>
@@ -6482,7 +6770,7 @@
               <w:rPr>
                 <w:sz w:val="12"/>
               </w:rPr>
-              <w:t>Seat Bolster, Left</w:t>
+              <w:t>Flange Locking Nut | Nut</w:t>
             </w:r>
           </w:p>
         </w:tc>
@@ -6496,7 +6784,7 @@
               <w:rPr>
                 <w:sz w:val="12"/>
               </w:rPr>
-              <w:t>Left | Seat Bolster, Left</w:t>
+              <w:t>Flange Locking Nut | Nut</w:t>
             </w:r>
           </w:p>
         </w:tc>
@@ -6512,7 +6800,7 @@
               <w:rPr>
                 <w:sz w:val="12"/>
               </w:rPr>
-              <w:t>rear-seats-second-row</w:t>
+              <w:t>seat-belts</w:t>
             </w:r>
           </w:p>
         </w:tc>
@@ -6526,7 +6814,7 @@
               <w:rPr>
                 <w:sz w:val="12"/>
               </w:rPr>
-              <w:t>5SB041X9AB</w:t>
+              <w:t>6509460AA</w:t>
             </w:r>
           </w:p>
         </w:tc>
@@ -6540,7 +6828,7 @@
               <w:rPr>
                 <w:sz w:val="12"/>
               </w:rPr>
-              <w:t>Seat Bolster, Right</w:t>
+              <w:t>Hex Nut | Nut</w:t>
             </w:r>
           </w:p>
         </w:tc>
@@ -6554,7 +6842,7 @@
               <w:rPr>
                 <w:sz w:val="12"/>
               </w:rPr>
-              <w:t>Right | Seat Bolster, Right</w:t>
+              <w:t>Hex Nut | Nut</w:t>
             </w:r>
           </w:p>
         </w:tc>
@@ -6570,7 +6858,7 @@
               <w:rPr>
                 <w:sz w:val="12"/>
               </w:rPr>
-              <w:t>rear-seats-second-row</w:t>
+              <w:t>seat-belts</w:t>
             </w:r>
           </w:p>
         </w:tc>
@@ -6584,7 +6872,7 @@
               <w:rPr>
                 <w:sz w:val="12"/>
               </w:rPr>
-              <w:t>5SB051X9AB</w:t>
+              <w:t>68080745AD</w:t>
             </w:r>
           </w:p>
         </w:tc>
@@ -6598,7 +6886,7 @@
               <w:rPr>
                 <w:sz w:val="12"/>
               </w:rPr>
-              <w:t>Seat Bolster, Left</w:t>
+              <w:t>Adjuster | Seat Belt Turning Loop Adjuster</w:t>
             </w:r>
           </w:p>
         </w:tc>
@@ -6612,7 +6900,7 @@
               <w:rPr>
                 <w:sz w:val="12"/>
               </w:rPr>
-              <w:t>Left | Seat Bolster, Left</w:t>
+              <w:t>Adjuster | Seat Belt Turning Loop Adjuster</w:t>
             </w:r>
           </w:p>
         </w:tc>
@@ -6628,7 +6916,7 @@
               <w:rPr>
                 <w:sz w:val="12"/>
               </w:rPr>
-              <w:t>rear-seats-second-row</w:t>
+              <w:t>seat-belts</w:t>
             </w:r>
           </w:p>
         </w:tc>
@@ -6642,7 +6930,7 @@
               <w:rPr>
                 <w:sz w:val="12"/>
               </w:rPr>
-              <w:t>5YA39DX9AA</w:t>
+              <w:t>68770846AA</w:t>
             </w:r>
           </w:p>
         </w:tc>
@@ -6656,7 +6944,7 @@
               <w:rPr>
                 <w:sz w:val="12"/>
               </w:rPr>
-              <w:t>Headrest | Rear Headrest</w:t>
+              <w:t>Buckle Assembly-S/Belt Buckle Assembly | Right</w:t>
             </w:r>
           </w:p>
         </w:tc>
@@ -6670,7 +6958,7 @@
               <w:rPr>
                 <w:sz w:val="12"/>
               </w:rPr>
-              <w:t>Headrest | Rear Headrest</w:t>
+              <w:t>Assy | Buckle Assembly-S/Belt Buckle Assembly</w:t>
             </w:r>
           </w:p>
         </w:tc>
@@ -6686,7 +6974,7 @@
               <w:rPr>
                 <w:sz w:val="12"/>
               </w:rPr>
-              <w:t>rear-seats-second-row</w:t>
+              <w:t>seat-belts</w:t>
             </w:r>
           </w:p>
         </w:tc>
@@ -6700,7 +6988,7 @@
               <w:rPr>
                 <w:sz w:val="12"/>
               </w:rPr>
-              <w:t>68102973AA</w:t>
+              <w:t>6ET081X9AB</w:t>
             </w:r>
           </w:p>
         </w:tc>
@@ -6714,7 +7002,7 @@
               <w:rPr>
                 <w:sz w:val="12"/>
               </w:rPr>
-              <w:t>Foam | Seat Back Foam</w:t>
+              <w:t>Right</w:t>
             </w:r>
           </w:p>
         </w:tc>
@@ -6728,7 +7016,7 @@
               <w:rPr>
                 <w:sz w:val="12"/>
               </w:rPr>
-              <w:t>Foam | Seat Back Foam</w:t>
+              <w:t>Right</w:t>
             </w:r>
           </w:p>
         </w:tc>
@@ -6744,7 +7032,7 @@
               <w:rPr>
                 <w:sz w:val="12"/>
               </w:rPr>
-              <w:t>rear-seats-second-row</w:t>
+              <w:t>seat-belts</w:t>
             </w:r>
           </w:p>
         </w:tc>
@@ -6758,7 +7046,7 @@
               <w:rPr>
                 <w:sz w:val="12"/>
               </w:rPr>
-              <w:t>68104310AA</w:t>
+              <w:t>6ET091X9AB</w:t>
             </w:r>
           </w:p>
         </w:tc>
@@ -6772,7 +7060,7 @@
               <w:rPr>
                 <w:sz w:val="12"/>
               </w:rPr>
-              <w:t>Foam | Seat Back Foam</w:t>
+              <w:t>Front Inner Seat Belt, Left | Left</w:t>
             </w:r>
           </w:p>
         </w:tc>
@@ -6786,7 +7074,7 @@
               <w:rPr>
                 <w:sz w:val="12"/>
               </w:rPr>
-              <w:t>Foam | Seat Back Foam</w:t>
+              <w:t>Front Inner Seat Belt, Left | Left</w:t>
             </w:r>
           </w:p>
         </w:tc>
@@ -6802,7 +7090,7 @@
               <w:rPr>
                 <w:sz w:val="12"/>
               </w:rPr>
-              <w:t>rear-seats-second-row</w:t>
+              <w:t>steering-column</w:t>
             </w:r>
           </w:p>
         </w:tc>
@@ -6816,7 +7104,7 @@
               <w:rPr>
                 <w:sz w:val="12"/>
               </w:rPr>
-              <w:t>68159129AA</w:t>
+              <w:t>6104406AA</w:t>
             </w:r>
           </w:p>
         </w:tc>
@@ -6830,7 +7118,7 @@
               <w:rPr>
                 <w:sz w:val="12"/>
               </w:rPr>
-              <w:t>Frame | Rear Seat Cushion Frame</w:t>
+              <w:t>Hex Head Screw And Washer | Washer</w:t>
             </w:r>
           </w:p>
         </w:tc>
@@ -6844,7 +7132,7 @@
               <w:rPr>
                 <w:sz w:val="12"/>
               </w:rPr>
-              <w:t>Frame | Rear Seat Cushion Frame</w:t>
+              <w:t>Hex Head Screw And Washer | Washer</w:t>
             </w:r>
           </w:p>
         </w:tc>
@@ -6860,7 +7148,7 @@
               <w:rPr>
                 <w:sz w:val="12"/>
               </w:rPr>
-              <w:t>rear-seats-second-row</w:t>
+              <w:t>steering-column</w:t>
             </w:r>
           </w:p>
         </w:tc>
@@ -6874,7 +7162,7 @@
               <w:rPr>
                 <w:sz w:val="12"/>
               </w:rPr>
-              <w:t>68159140AA</w:t>
+              <w:t>6104709AA</w:t>
             </w:r>
           </w:p>
         </w:tc>
@@ -6888,7 +7176,7 @@
               <w:rPr>
                 <w:sz w:val="12"/>
               </w:rPr>
-              <w:t>Foam | Seat Cushion Foam</w:t>
+              <w:t>Hex Flange Nut | Nut</w:t>
             </w:r>
           </w:p>
         </w:tc>
@@ -6902,7 +7190,7 @@
               <w:rPr>
                 <w:sz w:val="12"/>
               </w:rPr>
-              <w:t>Foam | Seat Cushion Foam</w:t>
+              <w:t>Hex Flange Nut | Nut</w:t>
             </w:r>
           </w:p>
         </w:tc>
@@ -6918,7 +7206,7 @@
               <w:rPr>
                 <w:sz w:val="12"/>
               </w:rPr>
-              <w:t>seat-belts</w:t>
+              <w:t>steering-column</w:t>
             </w:r>
           </w:p>
         </w:tc>
@@ -6932,7 +7220,7 @@
               <w:rPr>
                 <w:sz w:val="12"/>
               </w:rPr>
-              <w:t>1HZ06DX9AI</w:t>
+              <w:t>6104716AA</w:t>
             </w:r>
           </w:p>
         </w:tc>
@@ -6946,7 +7234,7 @@
               <w:rPr>
                 <w:sz w:val="12"/>
               </w:rPr>
-              <w:t>Front Outer Seat Belt, Right | Right</w:t>
+              <w:t>Hex Flange Nut | Nut</w:t>
             </w:r>
           </w:p>
         </w:tc>
@@ -6960,7 +7248,7 @@
               <w:rPr>
                 <w:sz w:val="12"/>
               </w:rPr>
-              <w:t>Front Outer Seat Belt, Right | Right</w:t>
+              <w:t>Hex Flange Nut | Nut</w:t>
             </w:r>
           </w:p>
         </w:tc>
@@ -6976,7 +7264,7 @@
               <w:rPr>
                 <w:sz w:val="12"/>
               </w:rPr>
-              <w:t>seat-belts</w:t>
+              <w:t>steering-column</w:t>
             </w:r>
           </w:p>
         </w:tc>
@@ -6990,7 +7278,7 @@
               <w:rPr>
                 <w:sz w:val="12"/>
               </w:rPr>
-              <w:t>5135197AA</w:t>
+              <w:t>6506950AA</w:t>
             </w:r>
           </w:p>
         </w:tc>
@@ -7004,7 +7292,7 @@
               <w:rPr>
                 <w:sz w:val="12"/>
               </w:rPr>
-              <w:t>Seat Belt Extender</w:t>
+              <w:t>Bolt | Hex Flange Head Locking Bolt</w:t>
             </w:r>
           </w:p>
         </w:tc>
@@ -7018,7 +7306,7 @@
               <w:rPr>
                 <w:sz w:val="12"/>
               </w:rPr>
-              <w:t>Seat Belt Extender</w:t>
+              <w:t>Bolt | Hex Flange Head Locking Bolt</w:t>
             </w:r>
           </w:p>
         </w:tc>
@@ -7034,7 +7322,7 @@
               <w:rPr>
                 <w:sz w:val="12"/>
               </w:rPr>
-              <w:t>seat-belts</w:t>
+              <w:t>steering-column</w:t>
             </w:r>
           </w:p>
         </w:tc>
@@ -7048,7 +7336,7 @@
               <w:rPr>
                 <w:sz w:val="12"/>
               </w:rPr>
-              <w:t>6105124AA</w:t>
+              <w:t>6510755AA</w:t>
             </w:r>
           </w:p>
         </w:tc>
@@ -7062,7 +7350,7 @@
               <w:rPr>
                 <w:sz w:val="12"/>
               </w:rPr>
-              <w:t>Pan Head Screw</w:t>
+              <w:t>Hex Head Screw And Washer | Washer</w:t>
             </w:r>
           </w:p>
         </w:tc>
@@ -7076,7 +7364,7 @@
               <w:rPr>
                 <w:sz w:val="12"/>
               </w:rPr>
-              <w:t>Pan Head Screw</w:t>
+              <w:t>Hex Head Screw And Washer | Washer</w:t>
             </w:r>
           </w:p>
         </w:tc>
@@ -7092,7 +7380,7 @@
               <w:rPr>
                 <w:sz w:val="12"/>
               </w:rPr>
-              <w:t>seat-belts</w:t>
+              <w:t>steering-column</w:t>
             </w:r>
           </w:p>
         </w:tc>
@@ -7106,7 +7394,7 @@
               <w:rPr>
                 <w:sz w:val="12"/>
               </w:rPr>
-              <w:t>6502724</w:t>
+              <w:t>68140569AG</w:t>
             </w:r>
           </w:p>
         </w:tc>
@@ -7120,7 +7408,7 @@
               <w:rPr>
                 <w:sz w:val="12"/>
               </w:rPr>
-              <w:t>Hex Flange Nut | Nut</w:t>
+              <w:t>2014-2021 Mopar Steering Column | Column</w:t>
             </w:r>
           </w:p>
         </w:tc>
@@ -7134,7 +7422,7 @@
               <w:rPr>
                 <w:sz w:val="12"/>
               </w:rPr>
-              <w:t>Hex Flange Nut | Nut</w:t>
+              <w:t>2014-2021 Mopar Steering Column | Column</w:t>
             </w:r>
           </w:p>
         </w:tc>
@@ -7150,7 +7438,7 @@
               <w:rPr>
                 <w:sz w:val="12"/>
               </w:rPr>
-              <w:t>seat-belts</w:t>
+              <w:t>steering-column</w:t>
             </w:r>
           </w:p>
         </w:tc>
@@ -7164,7 +7452,7 @@
               <w:rPr>
                 <w:sz w:val="12"/>
               </w:rPr>
-              <w:t>6504537</w:t>
+              <w:t>68259474AD</w:t>
             </w:r>
           </w:p>
         </w:tc>
@@ -7178,7 +7466,7 @@
               <w:rPr>
                 <w:sz w:val="12"/>
               </w:rPr>
-              <w:t>Flange Locking Nut | Nut</w:t>
+              <w:t>2014-2021 Mopar Steering Column | Column</w:t>
             </w:r>
           </w:p>
         </w:tc>
@@ -7192,703 +7480,7 @@
               <w:rPr>
                 <w:sz w:val="12"/>
               </w:rPr>
-              <w:t>Flange Locking Nut | Nut</w:t>
-            </w:r>
-          </w:p>
-        </w:tc>
-      </w:tr>
-      <w:tr>
-        <w:tc>
-          <w:tcPr>
-            <w:tcW w:type="dxa" w:w="2664"/>
-            <w:vAlign w:val="center"/>
-          </w:tcPr>
-          <w:p>
-            <w:r>
-              <w:rPr>
-                <w:sz w:val="12"/>
-              </w:rPr>
-              <w:t>seat-belts</w:t>
-            </w:r>
-          </w:p>
-        </w:tc>
-        <w:tc>
-          <w:tcPr>
-            <w:tcW w:type="dxa" w:w="2664"/>
-            <w:vAlign w:val="center"/>
-          </w:tcPr>
-          <w:p>
-            <w:r>
-              <w:rPr>
-                <w:sz w:val="12"/>
-              </w:rPr>
-              <w:t>6509460AA</w:t>
-            </w:r>
-          </w:p>
-        </w:tc>
-        <w:tc>
-          <w:tcPr>
-            <w:tcW w:type="dxa" w:w="2664"/>
-            <w:vAlign w:val="center"/>
-          </w:tcPr>
-          <w:p>
-            <w:r>
-              <w:rPr>
-                <w:sz w:val="12"/>
-              </w:rPr>
-              <w:t>Hex Nut | Nut</w:t>
-            </w:r>
-          </w:p>
-        </w:tc>
-        <w:tc>
-          <w:tcPr>
-            <w:tcW w:type="dxa" w:w="2664"/>
-            <w:vAlign w:val="center"/>
-          </w:tcPr>
-          <w:p>
-            <w:r>
-              <w:rPr>
-                <w:sz w:val="12"/>
-              </w:rPr>
-              <w:t>Hex Nut | Nut</w:t>
-            </w:r>
-          </w:p>
-        </w:tc>
-      </w:tr>
-      <w:tr>
-        <w:tc>
-          <w:tcPr>
-            <w:tcW w:type="dxa" w:w="2664"/>
-            <w:vAlign w:val="center"/>
-          </w:tcPr>
-          <w:p>
-            <w:r>
-              <w:rPr>
-                <w:sz w:val="12"/>
-              </w:rPr>
-              <w:t>seat-belts</w:t>
-            </w:r>
-          </w:p>
-        </w:tc>
-        <w:tc>
-          <w:tcPr>
-            <w:tcW w:type="dxa" w:w="2664"/>
-            <w:vAlign w:val="center"/>
-          </w:tcPr>
-          <w:p>
-            <w:r>
-              <w:rPr>
-                <w:sz w:val="12"/>
-              </w:rPr>
-              <w:t>68080745AD</w:t>
-            </w:r>
-          </w:p>
-        </w:tc>
-        <w:tc>
-          <w:tcPr>
-            <w:tcW w:type="dxa" w:w="2664"/>
-            <w:vAlign w:val="center"/>
-          </w:tcPr>
-          <w:p>
-            <w:r>
-              <w:rPr>
-                <w:sz w:val="12"/>
-              </w:rPr>
-              <w:t>Adjuster | Seat Belt Turning Loop Adjuster</w:t>
-            </w:r>
-          </w:p>
-        </w:tc>
-        <w:tc>
-          <w:tcPr>
-            <w:tcW w:type="dxa" w:w="2664"/>
-            <w:vAlign w:val="center"/>
-          </w:tcPr>
-          <w:p>
-            <w:r>
-              <w:rPr>
-                <w:sz w:val="12"/>
-              </w:rPr>
-              <w:t>Adjuster | Seat Belt Turning Loop Adjuster</w:t>
-            </w:r>
-          </w:p>
-        </w:tc>
-      </w:tr>
-      <w:tr>
-        <w:tc>
-          <w:tcPr>
-            <w:tcW w:type="dxa" w:w="2664"/>
-            <w:vAlign w:val="center"/>
-          </w:tcPr>
-          <w:p>
-            <w:r>
-              <w:rPr>
-                <w:sz w:val="12"/>
-              </w:rPr>
-              <w:t>seat-belts</w:t>
-            </w:r>
-          </w:p>
-        </w:tc>
-        <w:tc>
-          <w:tcPr>
-            <w:tcW w:type="dxa" w:w="2664"/>
-            <w:vAlign w:val="center"/>
-          </w:tcPr>
-          <w:p>
-            <w:r>
-              <w:rPr>
-                <w:sz w:val="12"/>
-              </w:rPr>
-              <w:t>68770846AA</w:t>
-            </w:r>
-          </w:p>
-        </w:tc>
-        <w:tc>
-          <w:tcPr>
-            <w:tcW w:type="dxa" w:w="2664"/>
-            <w:vAlign w:val="center"/>
-          </w:tcPr>
-          <w:p>
-            <w:r>
-              <w:rPr>
-                <w:sz w:val="12"/>
-              </w:rPr>
-              <w:t>Buckle Assembly-S/Belt Buckle Assembly | Right</w:t>
-            </w:r>
-          </w:p>
-        </w:tc>
-        <w:tc>
-          <w:tcPr>
-            <w:tcW w:type="dxa" w:w="2664"/>
-            <w:vAlign w:val="center"/>
-          </w:tcPr>
-          <w:p>
-            <w:r>
-              <w:rPr>
-                <w:sz w:val="12"/>
-              </w:rPr>
-              <w:t>Assy | Buckle Assembly-S/Belt Buckle Assembly</w:t>
-            </w:r>
-          </w:p>
-        </w:tc>
-      </w:tr>
-      <w:tr>
-        <w:tc>
-          <w:tcPr>
-            <w:tcW w:type="dxa" w:w="2664"/>
-            <w:vAlign w:val="center"/>
-          </w:tcPr>
-          <w:p>
-            <w:r>
-              <w:rPr>
-                <w:sz w:val="12"/>
-              </w:rPr>
-              <w:t>seat-belts</w:t>
-            </w:r>
-          </w:p>
-        </w:tc>
-        <w:tc>
-          <w:tcPr>
-            <w:tcW w:type="dxa" w:w="2664"/>
-            <w:vAlign w:val="center"/>
-          </w:tcPr>
-          <w:p>
-            <w:r>
-              <w:rPr>
-                <w:sz w:val="12"/>
-              </w:rPr>
-              <w:t>6ET091X9AB</w:t>
-            </w:r>
-          </w:p>
-        </w:tc>
-        <w:tc>
-          <w:tcPr>
-            <w:tcW w:type="dxa" w:w="2664"/>
-            <w:vAlign w:val="center"/>
-          </w:tcPr>
-          <w:p>
-            <w:r>
-              <w:rPr>
-                <w:sz w:val="12"/>
-              </w:rPr>
-              <w:t>Front Inner Seat Belt, Left | Left</w:t>
-            </w:r>
-          </w:p>
-        </w:tc>
-        <w:tc>
-          <w:tcPr>
-            <w:tcW w:type="dxa" w:w="2664"/>
-            <w:vAlign w:val="center"/>
-          </w:tcPr>
-          <w:p>
-            <w:r>
-              <w:rPr>
-                <w:sz w:val="12"/>
-              </w:rPr>
-              <w:t>Front Inner Seat Belt, Left | Left</w:t>
-            </w:r>
-          </w:p>
-        </w:tc>
-      </w:tr>
-      <w:tr>
-        <w:tc>
-          <w:tcPr>
-            <w:tcW w:type="dxa" w:w="2664"/>
-            <w:vAlign w:val="center"/>
-          </w:tcPr>
-          <w:p>
-            <w:r>
-              <w:rPr>
-                <w:sz w:val="12"/>
-              </w:rPr>
-              <w:t>steering-column</w:t>
-            </w:r>
-          </w:p>
-        </w:tc>
-        <w:tc>
-          <w:tcPr>
-            <w:tcW w:type="dxa" w:w="2664"/>
-            <w:vAlign w:val="center"/>
-          </w:tcPr>
-          <w:p>
-            <w:r>
-              <w:rPr>
-                <w:sz w:val="12"/>
-              </w:rPr>
-              <w:t>6104406AA</w:t>
-            </w:r>
-          </w:p>
-        </w:tc>
-        <w:tc>
-          <w:tcPr>
-            <w:tcW w:type="dxa" w:w="2664"/>
-            <w:vAlign w:val="center"/>
-          </w:tcPr>
-          <w:p>
-            <w:r>
-              <w:rPr>
-                <w:sz w:val="12"/>
-              </w:rPr>
-              <w:t>Hex Head Screw And Washer | Washer</w:t>
-            </w:r>
-          </w:p>
-        </w:tc>
-        <w:tc>
-          <w:tcPr>
-            <w:tcW w:type="dxa" w:w="2664"/>
-            <w:vAlign w:val="center"/>
-          </w:tcPr>
-          <w:p>
-            <w:r>
-              <w:rPr>
-                <w:sz w:val="12"/>
-              </w:rPr>
-              <w:t>Hex Head Screw And Washer | Washer</w:t>
-            </w:r>
-          </w:p>
-        </w:tc>
-      </w:tr>
-      <w:tr>
-        <w:tc>
-          <w:tcPr>
-            <w:tcW w:type="dxa" w:w="2664"/>
-            <w:vAlign w:val="center"/>
-          </w:tcPr>
-          <w:p>
-            <w:r>
-              <w:rPr>
-                <w:sz w:val="12"/>
-              </w:rPr>
-              <w:t>steering-column</w:t>
-            </w:r>
-          </w:p>
-        </w:tc>
-        <w:tc>
-          <w:tcPr>
-            <w:tcW w:type="dxa" w:w="2664"/>
-            <w:vAlign w:val="center"/>
-          </w:tcPr>
-          <w:p>
-            <w:r>
-              <w:rPr>
-                <w:sz w:val="12"/>
-              </w:rPr>
-              <w:t>6104709AA</w:t>
-            </w:r>
-          </w:p>
-        </w:tc>
-        <w:tc>
-          <w:tcPr>
-            <w:tcW w:type="dxa" w:w="2664"/>
-            <w:vAlign w:val="center"/>
-          </w:tcPr>
-          <w:p>
-            <w:r>
-              <w:rPr>
-                <w:sz w:val="12"/>
-              </w:rPr>
-              <w:t>Hex Flange Nut | Nut</w:t>
-            </w:r>
-          </w:p>
-        </w:tc>
-        <w:tc>
-          <w:tcPr>
-            <w:tcW w:type="dxa" w:w="2664"/>
-            <w:vAlign w:val="center"/>
-          </w:tcPr>
-          <w:p>
-            <w:r>
-              <w:rPr>
-                <w:sz w:val="12"/>
-              </w:rPr>
-              <w:t>Hex Flange Nut | Nut</w:t>
-            </w:r>
-          </w:p>
-        </w:tc>
-      </w:tr>
-      <w:tr>
-        <w:tc>
-          <w:tcPr>
-            <w:tcW w:type="dxa" w:w="2664"/>
-            <w:vAlign w:val="center"/>
-          </w:tcPr>
-          <w:p>
-            <w:r>
-              <w:rPr>
-                <w:sz w:val="12"/>
-              </w:rPr>
-              <w:t>steering-column</w:t>
-            </w:r>
-          </w:p>
-        </w:tc>
-        <w:tc>
-          <w:tcPr>
-            <w:tcW w:type="dxa" w:w="2664"/>
-            <w:vAlign w:val="center"/>
-          </w:tcPr>
-          <w:p>
-            <w:r>
-              <w:rPr>
-                <w:sz w:val="12"/>
-              </w:rPr>
-              <w:t>6104716AA</w:t>
-            </w:r>
-          </w:p>
-        </w:tc>
-        <w:tc>
-          <w:tcPr>
-            <w:tcW w:type="dxa" w:w="2664"/>
-            <w:vAlign w:val="center"/>
-          </w:tcPr>
-          <w:p>
-            <w:r>
-              <w:rPr>
-                <w:sz w:val="12"/>
-              </w:rPr>
-              <w:t>Hex Flange Nut | Nut</w:t>
-            </w:r>
-          </w:p>
-        </w:tc>
-        <w:tc>
-          <w:tcPr>
-            <w:tcW w:type="dxa" w:w="2664"/>
-            <w:vAlign w:val="center"/>
-          </w:tcPr>
-          <w:p>
-            <w:r>
-              <w:rPr>
-                <w:sz w:val="12"/>
-              </w:rPr>
-              <w:t>Hex Flange Nut | Nut</w:t>
-            </w:r>
-          </w:p>
-        </w:tc>
-      </w:tr>
-      <w:tr>
-        <w:tc>
-          <w:tcPr>
-            <w:tcW w:type="dxa" w:w="2664"/>
-            <w:vAlign w:val="center"/>
-          </w:tcPr>
-          <w:p>
-            <w:r>
-              <w:rPr>
-                <w:sz w:val="12"/>
-              </w:rPr>
-              <w:t>steering-column</w:t>
-            </w:r>
-          </w:p>
-        </w:tc>
-        <w:tc>
-          <w:tcPr>
-            <w:tcW w:type="dxa" w:w="2664"/>
-            <w:vAlign w:val="center"/>
-          </w:tcPr>
-          <w:p>
-            <w:r>
-              <w:rPr>
-                <w:sz w:val="12"/>
-              </w:rPr>
-              <w:t>6506950AA</w:t>
-            </w:r>
-          </w:p>
-        </w:tc>
-        <w:tc>
-          <w:tcPr>
-            <w:tcW w:type="dxa" w:w="2664"/>
-            <w:vAlign w:val="center"/>
-          </w:tcPr>
-          <w:p>
-            <w:r>
-              <w:rPr>
-                <w:sz w:val="12"/>
-              </w:rPr>
-              <w:t>Bolt | Hex Flange Head Locking Bolt</w:t>
-            </w:r>
-          </w:p>
-        </w:tc>
-        <w:tc>
-          <w:tcPr>
-            <w:tcW w:type="dxa" w:w="2664"/>
-            <w:vAlign w:val="center"/>
-          </w:tcPr>
-          <w:p>
-            <w:r>
-              <w:rPr>
-                <w:sz w:val="12"/>
-              </w:rPr>
-              <w:t>Bolt | Hex Flange Head Locking Bolt</w:t>
-            </w:r>
-          </w:p>
-        </w:tc>
-      </w:tr>
-      <w:tr>
-        <w:tc>
-          <w:tcPr>
-            <w:tcW w:type="dxa" w:w="2664"/>
-            <w:vAlign w:val="center"/>
-          </w:tcPr>
-          <w:p>
-            <w:r>
-              <w:rPr>
-                <w:sz w:val="12"/>
-              </w:rPr>
-              <w:t>steering-column</w:t>
-            </w:r>
-          </w:p>
-        </w:tc>
-        <w:tc>
-          <w:tcPr>
-            <w:tcW w:type="dxa" w:w="2664"/>
-            <w:vAlign w:val="center"/>
-          </w:tcPr>
-          <w:p>
-            <w:r>
-              <w:rPr>
-                <w:sz w:val="12"/>
-              </w:rPr>
-              <w:t>6510755AA</w:t>
-            </w:r>
-          </w:p>
-        </w:tc>
-        <w:tc>
-          <w:tcPr>
-            <w:tcW w:type="dxa" w:w="2664"/>
-            <w:vAlign w:val="center"/>
-          </w:tcPr>
-          <w:p>
-            <w:r>
-              <w:rPr>
-                <w:sz w:val="12"/>
-              </w:rPr>
-              <w:t>Hex Head Screw And Washer | Washer</w:t>
-            </w:r>
-          </w:p>
-        </w:tc>
-        <w:tc>
-          <w:tcPr>
-            <w:tcW w:type="dxa" w:w="2664"/>
-            <w:vAlign w:val="center"/>
-          </w:tcPr>
-          <w:p>
-            <w:r>
-              <w:rPr>
-                <w:sz w:val="12"/>
-              </w:rPr>
-              <w:t>Hex Head Screw And Washer | Washer</w:t>
-            </w:r>
-          </w:p>
-        </w:tc>
-      </w:tr>
-      <w:tr>
-        <w:tc>
-          <w:tcPr>
-            <w:tcW w:type="dxa" w:w="2664"/>
-            <w:vAlign w:val="center"/>
-          </w:tcPr>
-          <w:p>
-            <w:r>
-              <w:rPr>
-                <w:sz w:val="12"/>
-              </w:rPr>
-              <w:t>steering-column</w:t>
-            </w:r>
-          </w:p>
-        </w:tc>
-        <w:tc>
-          <w:tcPr>
-            <w:tcW w:type="dxa" w:w="2664"/>
-            <w:vAlign w:val="center"/>
-          </w:tcPr>
-          <w:p>
-            <w:r>
-              <w:rPr>
-                <w:sz w:val="12"/>
-              </w:rPr>
-              <w:t>68140569AG</w:t>
-            </w:r>
-          </w:p>
-        </w:tc>
-        <w:tc>
-          <w:tcPr>
-            <w:tcW w:type="dxa" w:w="2664"/>
-            <w:vAlign w:val="center"/>
-          </w:tcPr>
-          <w:p>
-            <w:r>
-              <w:rPr>
-                <w:sz w:val="12"/>
-              </w:rPr>
               <w:t>2014-2021 Mopar Steering Column | Column</w:t>
-            </w:r>
-          </w:p>
-        </w:tc>
-        <w:tc>
-          <w:tcPr>
-            <w:tcW w:type="dxa" w:w="2664"/>
-            <w:vAlign w:val="center"/>
-          </w:tcPr>
-          <w:p>
-            <w:r>
-              <w:rPr>
-                <w:sz w:val="12"/>
-              </w:rPr>
-              <w:t>2014-2021 Mopar Steering Column | Column</w:t>
-            </w:r>
-          </w:p>
-        </w:tc>
-      </w:tr>
-      <w:tr>
-        <w:tc>
-          <w:tcPr>
-            <w:tcW w:type="dxa" w:w="2664"/>
-            <w:vAlign w:val="center"/>
-          </w:tcPr>
-          <w:p>
-            <w:r>
-              <w:rPr>
-                <w:sz w:val="12"/>
-              </w:rPr>
-              <w:t>steering-column</w:t>
-            </w:r>
-          </w:p>
-        </w:tc>
-        <w:tc>
-          <w:tcPr>
-            <w:tcW w:type="dxa" w:w="2664"/>
-            <w:vAlign w:val="center"/>
-          </w:tcPr>
-          <w:p>
-            <w:r>
-              <w:rPr>
-                <w:sz w:val="12"/>
-              </w:rPr>
-              <w:t>68259474AD</w:t>
-            </w:r>
-          </w:p>
-        </w:tc>
-        <w:tc>
-          <w:tcPr>
-            <w:tcW w:type="dxa" w:w="2664"/>
-            <w:vAlign w:val="center"/>
-          </w:tcPr>
-          <w:p>
-            <w:r>
-              <w:rPr>
-                <w:sz w:val="12"/>
-              </w:rPr>
-              <w:t>2014-2021 Mopar Steering Column | Column</w:t>
-            </w:r>
-          </w:p>
-        </w:tc>
-        <w:tc>
-          <w:tcPr>
-            <w:tcW w:type="dxa" w:w="2664"/>
-            <w:vAlign w:val="center"/>
-          </w:tcPr>
-          <w:p>
-            <w:r>
-              <w:rPr>
-                <w:sz w:val="12"/>
-              </w:rPr>
-              <w:t>2014-2021 Mopar Steering Column | Column</w:t>
-            </w:r>
-          </w:p>
-        </w:tc>
-      </w:tr>
-      <w:tr>
-        <w:tc>
-          <w:tcPr>
-            <w:tcW w:type="dxa" w:w="2664"/>
-            <w:vAlign w:val="center"/>
-          </w:tcPr>
-          <w:p>
-            <w:r>
-              <w:rPr>
-                <w:sz w:val="12"/>
-              </w:rPr>
-              <w:t>steering-wheel</w:t>
-            </w:r>
-          </w:p>
-        </w:tc>
-        <w:tc>
-          <w:tcPr>
-            <w:tcW w:type="dxa" w:w="2664"/>
-            <w:vAlign w:val="center"/>
-          </w:tcPr>
-          <w:p>
-            <w:r>
-              <w:rPr>
-                <w:sz w:val="12"/>
-              </w:rPr>
-              <w:t>6511907AA</w:t>
-            </w:r>
-          </w:p>
-        </w:tc>
-        <w:tc>
-          <w:tcPr>
-            <w:tcW w:type="dxa" w:w="2664"/>
-            <w:vAlign w:val="center"/>
-          </w:tcPr>
-          <w:p>
-            <w:r>
-              <w:rPr>
-                <w:sz w:val="12"/>
-              </w:rPr>
-              <w:t>Oval Head Screw | Screw</w:t>
-            </w:r>
-          </w:p>
-        </w:tc>
-        <w:tc>
-          <w:tcPr>
-            <w:tcW w:type="dxa" w:w="2664"/>
-            <w:vAlign w:val="center"/>
-          </w:tcPr>
-          <w:p>
-            <w:r>
-              <w:rPr>
-                <w:sz w:val="12"/>
-              </w:rPr>
-              <w:t>Oval Head Screw | Screw</w:t>
             </w:r>
           </w:p>
         </w:tc>
@@ -8904,7 +8496,7 @@
     </w:p>
     <w:p>
       <w:r>
-        <w:t>https://www.moparamerica.com/v-2017-chrysler-300--c--3-6l-v6-flex/interior-trim--front-seats-adjusters-recliners-shields-and-risers?assembly=1</w:t>
+        <w:t>https://www.moparamerica.com/v-2017-chrysler-300--c--3-6l-v6-gas/interior-trim--front-seats-adjusters-recliners-shields-and-risers?assembly=1</w:t>
       </w:r>
     </w:p>
     <w:p>
@@ -8961,12 +8553,12 @@
         <w:pStyle w:val="Heading2"/>
       </w:pPr>
       <w:r>
-        <w:t>18. 2C3CCAEG4HH586472 — front-seat-adjusters — 2: Hex Head Screw</w:t>
+        <w:t>18. 2C3CCAEG4HH586472 — front-seat-adjusters — 2: Airbag Chute</w:t>
       </w:r>
     </w:p>
     <w:p>
       <w:r>
-        <w:t>https://www.moparamerica.com/v-2017-chrysler-300--c--3-6l-v6-flex/interior-trim--front-seats-adjusters-recliners-shields-and-risers?assembly=2</w:t>
+        <w:t>https://www.moparamerica.com/v-2017-chrysler-300--c--3-6l-v6-gas/interior-trim--front-seats-adjusters-recliners-shields-and-risers?assembly=2</w:t>
       </w:r>
     </w:p>
     <w:p>
@@ -9028,7 +8620,7 @@
     </w:p>
     <w:p>
       <w:r>
-        <w:t>https://www.moparamerica.com/v-2017-chrysler-300--c--3-6l-v6-flex/interior-trim--front-seats-adjusters-recliners-shields-and-risers?assembly=3</w:t>
+        <w:t>https://www.moparamerica.com/v-2017-chrysler-300--c--3-6l-v6-gas/interior-trim--front-seats-adjusters-recliners-shields-and-risers?assembly=3</w:t>
       </w:r>
     </w:p>
     <w:p>
@@ -9090,7 +8682,7 @@
     </w:p>
     <w:p>
       <w:r>
-        <w:t>https://www.moparamerica.com/v-2017-chrysler-300--c--3-6l-v6-flex/interior-trim--front-seats-first-row?assembly=1</w:t>
+        <w:t>https://www.moparamerica.com/v-2017-chrysler-300--c--3-6l-v6-gas/interior-trim--front-seats-first-row?assembly=1</w:t>
       </w:r>
     </w:p>
     <w:p>
@@ -9152,7 +8744,7 @@
     </w:p>
     <w:p>
       <w:r>
-        <w:t>https://www.moparamerica.com/v-2017-chrysler-300--c--3-6l-v6-flex/interior-trim--front-seats-first-row?assembly=2</w:t>
+        <w:t>https://www.moparamerica.com/v-2017-chrysler-300--c--3-6l-v6-gas/interior-trim--front-seats-first-row?assembly=2</w:t>
       </w:r>
     </w:p>
     <w:p>
@@ -9214,7 +8806,7 @@
     </w:p>
     <w:p>
       <w:r>
-        <w:t>https://www.moparamerica.com/v-2017-chrysler-300--c--3-6l-v6-flex/interior-trim--front-seats-first-row?assembly=3</w:t>
+        <w:t>https://www.moparamerica.com/v-2017-chrysler-300--c--3-6l-v6-gas/interior-trim--front-seats-first-row?assembly=3</w:t>
       </w:r>
     </w:p>
     <w:p>
@@ -9276,7 +8868,7 @@
     </w:p>
     <w:p>
       <w:r>
-        <w:t>https://www.moparamerica.com/v-2017-chrysler-300--c--3-6l-v6-flex/interior-trim--front-seats-first-row?assembly=4</w:t>
+        <w:t>https://www.moparamerica.com/v-2017-chrysler-300--c--3-6l-v6-gas/interior-trim--front-seats-first-row?assembly=4</w:t>
       </w:r>
     </w:p>
     <w:p>
@@ -9338,7 +8930,7 @@
     </w:p>
     <w:p>
       <w:r>
-        <w:t>https://www.moparamerica.com/v-2017-chrysler-300--c--3-6l-v6-flex/interior-trim--front-seats-first-row?assembly=5</w:t>
+        <w:t>https://www.moparamerica.com/v-2017-chrysler-300--c--3-6l-v6-gas/interior-trim--front-seats-first-row?assembly=5</w:t>
       </w:r>
     </w:p>
     <w:p>
@@ -9400,7 +8992,7 @@
     </w:p>
     <w:p>
       <w:r>
-        <w:t>https://www.moparamerica.com/v-2017-chrysler-300--c--3-6l-v6-flex/interior-trim--front-seats-first-row?assembly=6</w:t>
+        <w:t>https://www.moparamerica.com/v-2017-chrysler-300--c--3-6l-v6-gas/interior-trim--front-seats-first-row?assembly=6</w:t>
       </w:r>
     </w:p>
     <w:p>
@@ -9462,7 +9054,7 @@
     </w:p>
     <w:p>
       <w:r>
-        <w:t>https://www.moparamerica.com/v-2017-chrysler-300--c--3-6l-v6-flex/interior-trim--front-seats-first-row?assembly=7</w:t>
+        <w:t>https://www.moparamerica.com/v-2017-chrysler-300--c--3-6l-v6-gas/interior-trim--front-seats-first-row?assembly=7</w:t>
       </w:r>
     </w:p>
     <w:p>
@@ -9524,7 +9116,7 @@
     </w:p>
     <w:p>
       <w:r>
-        <w:t>https://www.moparamerica.com/v-2017-chrysler-300--c--3-6l-v6-flex/interior-trim--rear-seats-second-row?assembly=1</w:t>
+        <w:t>https://www.moparamerica.com/v-2017-chrysler-300--c--3-6l-v6-gas/interior-trim--rear-seats-second-row?assembly=1</w:t>
       </w:r>
     </w:p>
     <w:p>
@@ -9586,7 +9178,7 @@
     </w:p>
     <w:p>
       <w:r>
-        <w:t>https://www.moparamerica.com/v-2017-chrysler-300--c--3-6l-v6-flex/interior-trim--rear-seats-second-row?assembly=2</w:t>
+        <w:t>https://www.moparamerica.com/v-2017-chrysler-300--c--3-6l-v6-gas/interior-trim--rear-seats-second-row?assembly=2</w:t>
       </w:r>
     </w:p>
     <w:p>
@@ -9648,7 +9240,7 @@
     </w:p>
     <w:p>
       <w:r>
-        <w:t>https://www.moparamerica.com/v-2017-chrysler-300--c--3-6l-v6-flex/interior-trim--rear-seats-second-row?assembly=3</w:t>
+        <w:t>https://www.moparamerica.com/v-2017-chrysler-300--c--3-6l-v6-gas/interior-trim--rear-seats-second-row?assembly=3</w:t>
       </w:r>
     </w:p>
     <w:p>
@@ -9710,7 +9302,7 @@
     </w:p>
     <w:p>
       <w:r>
-        <w:t>https://www.moparamerica.com/v-2017-chrysler-300--c--3-6l-v6-flex/interior-trim--rear-seats-second-row?assembly=4</w:t>
+        <w:t>https://www.moparamerica.com/v-2017-chrysler-300--c--3-6l-v6-gas/interior-trim--rear-seats-second-row?assembly=4</w:t>
       </w:r>
     </w:p>
     <w:p>
@@ -9772,7 +9364,7 @@
     </w:p>
     <w:p>
       <w:r>
-        <w:t>https://www.moparamerica.com/v-2017-chrysler-300--c--3-6l-v6-flex/interior-trim--rear-seats-second-row?assembly=5</w:t>
+        <w:t>https://www.moparamerica.com/v-2017-chrysler-300--c--3-6l-v6-gas/interior-trim--rear-seats-second-row?assembly=5</w:t>
       </w:r>
     </w:p>
     <w:p>
@@ -9834,7 +9426,7 @@
     </w:p>
     <w:p>
       <w:r>
-        <w:t>https://www.moparamerica.com/v-2017-chrysler-300--c--3-6l-v6-flex/interior-trim--rear-seats-second-row?assembly=6</w:t>
+        <w:t>https://www.moparamerica.com/v-2017-chrysler-300--c--3-6l-v6-gas/interior-trim--rear-seats-second-row?assembly=6</w:t>
       </w:r>
     </w:p>
     <w:p>
@@ -9896,7 +9488,7 @@
     </w:p>
     <w:p>
       <w:r>
-        <w:t>https://www.moparamerica.com/v-2017-chrysler-300--c--3-6l-v6-flex/interior-trim--rear-seats-second-row?assembly=7</w:t>
+        <w:t>https://www.moparamerica.com/v-2017-chrysler-300--c--3-6l-v6-gas/interior-trim--rear-seats-second-row?assembly=7</w:t>
       </w:r>
     </w:p>
     <w:p>
@@ -9958,7 +9550,7 @@
     </w:p>
     <w:p>
       <w:r>
-        <w:t>https://www.moparamerica.com/v-2017-chrysler-300--c--3-6l-v6-flex/interior-trim--rear-seats-second-row?assembly=8</w:t>
+        <w:t>https://www.moparamerica.com/v-2017-chrysler-300--c--3-6l-v6-gas/interior-trim--rear-seats-second-row?assembly=8</w:t>
       </w:r>
     </w:p>
     <w:p>
@@ -10015,12 +9607,12 @@
         <w:pStyle w:val="Heading2"/>
       </w:pPr>
       <w:r>
-        <w:t>35. 2C3CCAEG4HH586472 — rear-seats-second-row — 9: Seat Bolster, Right</w:t>
+        <w:t>35. 2C3CCAEG4HH586472 — rear-seats-second-row — 9: Seat Bolster, Left</w:t>
       </w:r>
     </w:p>
     <w:p>
       <w:r>
-        <w:t>https://www.moparamerica.com/v-2017-chrysler-300--c--3-6l-v6-flex/interior-trim--rear-seats-second-row?assembly=9</w:t>
+        <w:t>https://www.moparamerica.com/v-2017-chrysler-300--c--3-6l-v6-gas/interior-trim--rear-seats-second-row?assembly=9</w:t>
       </w:r>
     </w:p>
     <w:p>
@@ -10082,7 +9674,7 @@
     </w:p>
     <w:p>
       <w:r>
-        <w:t>https://www.moparamerica.com/v-2017-chrysler-300--c--3-6l-v6-flex/interior-trim--rear-seats-second-row?assembly=10</w:t>
+        <w:t>https://www.moparamerica.com/v-2017-chrysler-300--c--3-6l-v6-gas/interior-trim--rear-seats-second-row?assembly=10</w:t>
       </w:r>
     </w:p>
     <w:p>
@@ -10139,12 +9731,12 @@
         <w:pStyle w:val="Heading2"/>
       </w:pPr>
       <w:r>
-        <w:t>37. 2C3CCAEG4HH586472 — seat-belts — 1: Seat Belt Extender</w:t>
+        <w:t>37. 2C3CCAEG4HH586472 — rear-seat-adjusters — 1: Bushing 32</w:t>
       </w:r>
     </w:p>
     <w:p>
       <w:r>
-        <w:t>https://www.moparamerica.com/v-2017-chrysler-300--c--3-6l-v6-flex/restraints--seat-belts?assembly=1</w:t>
+        <w:t>https://www.moparamerica.com/v-2017-chrysler-300--c--3-6l-v6-gas/interior-trim--rear-seats-second-row-adjusters-recliners-shields-and-risers</w:t>
       </w:r>
     </w:p>
     <w:p>
@@ -10163,11 +9755,73 @@
               <a:graphicData uri="http://schemas.openxmlformats.org/drawingml/2006/picture">
                 <pic:pic>
                   <pic:nvPicPr>
+                    <pic:cNvPr id="0" name="rear-seat-adjusters__assembly-01.png"/>
+                    <pic:cNvPicPr/>
+                  </pic:nvPicPr>
+                  <pic:blipFill>
+                    <a:blip r:embed="rId46"/>
+                    <a:stretch>
+                      <a:fillRect/>
+                    </a:stretch>
+                  </pic:blipFill>
+                  <pic:spPr>
+                    <a:xfrm>
+                      <a:off x="0" y="0"/>
+                      <a:ext cx="6217920" cy="7551247"/>
+                    </a:xfrm>
+                    <a:prstGeom prst="rect"/>
+                  </pic:spPr>
+                </pic:pic>
+              </a:graphicData>
+            </a:graphic>
+          </wp:inline>
+        </w:drawing>
+      </w:r>
+    </w:p>
+    <w:p>
+      <w:r>
+        <w:t>Catalog part rows on diagram page: 51. SHA-256: fc5d5b0a985518361649e8b5d9960736f2b1c9491a9c5e20f0c3c2064f13a46a</w:t>
+      </w:r>
+    </w:p>
+    <w:p>
+      <w:r>
+        <w:br w:type="page"/>
+      </w:r>
+    </w:p>
+    <w:p>
+      <w:pPr>
+        <w:pStyle w:val="Heading2"/>
+      </w:pPr>
+      <w:r>
+        <w:t>38. 2C3CCAEG4HH586472 — seat-belts — 1: Seat Belt Extender</w:t>
+      </w:r>
+    </w:p>
+    <w:p>
+      <w:r>
+        <w:t>https://www.moparamerica.com/v-2017-chrysler-300--c--3-6l-v6-gas/restraints--seat-belts?assembly=1</w:t>
+      </w:r>
+    </w:p>
+    <w:p>
+      <w:pPr>
+        <w:jc w:val="center"/>
+      </w:pPr>
+      <w:r>
+        <w:drawing>
+          <wp:inline xmlns:a="http://schemas.openxmlformats.org/drawingml/2006/main" xmlns:pic="http://schemas.openxmlformats.org/drawingml/2006/picture">
+            <wp:extent cx="6217920" cy="7551247"/>
+            <wp:docPr id="39" name="Picture 39"/>
+            <wp:cNvGraphicFramePr>
+              <a:graphicFrameLocks noChangeAspect="1"/>
+            </wp:cNvGraphicFramePr>
+            <a:graphic>
+              <a:graphicData uri="http://schemas.openxmlformats.org/drawingml/2006/picture">
+                <pic:pic>
+                  <pic:nvPicPr>
                     <pic:cNvPr id="0" name="seat-belts__assembly-01.png"/>
                     <pic:cNvPicPr/>
                   </pic:nvPicPr>
                   <pic:blipFill>
-                    <a:blip r:embed="rId46"/>
+                    <a:blip r:embed="rId47"/>
                     <a:stretch>
                       <a:fillRect/>
                     </a:stretch>
@@ -10201,12 +9855,12 @@
         <w:pStyle w:val="Heading2"/>
       </w:pPr>
       <w:r>
-        <w:t>38. 2C3CCAEG4HH586472 — seat-belts — 2: Retractor Seat Belt</w:t>
+        <w:t>39. 2C3CCAEG4HH586472 — seat-belts — 2: Retractor Seat Belt</w:t>
       </w:r>
     </w:p>
     <w:p>
       <w:r>
-        <w:t>https://www.moparamerica.com/v-2017-chrysler-300--c--3-6l-v6-flex/restraints--seat-belts?assembly=2</w:t>
+        <w:t>https://www.moparamerica.com/v-2017-chrysler-300--c--3-6l-v6-gas/restraints--seat-belts?assembly=2</w:t>
       </w:r>
     </w:p>
     <w:p>
@@ -10217,7 +9871,7 @@
         <w:drawing>
           <wp:inline xmlns:a="http://schemas.openxmlformats.org/drawingml/2006/main" xmlns:pic="http://schemas.openxmlformats.org/drawingml/2006/picture">
             <wp:extent cx="6217920" cy="7551247"/>
-            <wp:docPr id="39" name="Picture 39"/>
+            <wp:docPr id="40" name="Picture 40"/>
             <wp:cNvGraphicFramePr>
               <a:graphicFrameLocks noChangeAspect="1"/>
             </wp:cNvGraphicFramePr>
@@ -10229,7 +9883,7 @@
                     <pic:cNvPicPr/>
                   </pic:nvPicPr>
                   <pic:blipFill>
-                    <a:blip r:embed="rId47"/>
+                    <a:blip r:embed="rId48"/>
                     <a:stretch>
                       <a:fillRect/>
                     </a:stretch>
@@ -10263,12 +9917,12 @@
         <w:pStyle w:val="Heading2"/>
       </w:pPr>
       <w:r>
-        <w:t>39. 2C3CCAEG4HH586472 — air-bags — 1: Screw</w:t>
+        <w:t>40. 2C3CCAEG4HH586472 — air-bags — 1: Screw</w:t>
       </w:r>
     </w:p>
     <w:p>
       <w:r>
-        <w:t>https://www.moparamerica.com/v-2017-chrysler-300--c--3-6l-v6-flex/restraints--air-bags?assembly=1</w:t>
+        <w:t>https://www.moparamerica.com/v-2017-chrysler-300--c--3-6l-v6-gas/restraints--air-bags?assembly=1</w:t>
       </w:r>
     </w:p>
     <w:p>
@@ -10279,7 +9933,7 @@
         <w:drawing>
           <wp:inline xmlns:a="http://schemas.openxmlformats.org/drawingml/2006/main" xmlns:pic="http://schemas.openxmlformats.org/drawingml/2006/picture">
             <wp:extent cx="6217920" cy="7551247"/>
-            <wp:docPr id="40" name="Picture 40"/>
+            <wp:docPr id="41" name="Picture 41"/>
             <wp:cNvGraphicFramePr>
               <a:graphicFrameLocks noChangeAspect="1"/>
             </wp:cNvGraphicFramePr>
@@ -10291,7 +9945,7 @@
                     <pic:cNvPicPr/>
                   </pic:nvPicPr>
                   <pic:blipFill>
-                    <a:blip r:embed="rId48"/>
+                    <a:blip r:embed="rId49"/>
                     <a:stretch>
                       <a:fillRect/>
                     </a:stretch>
@@ -10312,7 +9966,7 @@
     </w:p>
     <w:p>
       <w:r>
-        <w:t>Catalog part rows on diagram page: 18. SHA-256: 979485852b6e79bca48448b84f256b68956781e0aa4bd4b86fe02a039d014c5c</w:t>
+        <w:t>Catalog part rows on diagram page: 17. SHA-256: 979485852b6e79bca48448b84f256b68956781e0aa4bd4b86fe02a039d014c5c</w:t>
       </w:r>
     </w:p>
     <w:p>
@@ -10325,12 +9979,12 @@
         <w:pStyle w:val="Heading2"/>
       </w:pPr>
       <w:r>
-        <w:t>40. 2C3CCAEG4HH586472 — air-bags — 2: Side Curtain Air Bag, Right</w:t>
+        <w:t>41. 2C3CCAEG4HH586472 — air-bags — 2: Side Curtain Air Bag, Left</w:t>
       </w:r>
     </w:p>
     <w:p>
       <w:r>
-        <w:t>https://www.moparamerica.com/v-2017-chrysler-300--c--3-6l-v6-flex/restraints--air-bags?assembly=2</w:t>
+        <w:t>https://www.moparamerica.com/v-2017-chrysler-300--c--3-6l-v6-gas/restraints--air-bags?assembly=2</w:t>
       </w:r>
     </w:p>
     <w:p>
@@ -10341,7 +9995,7 @@
         <w:drawing>
           <wp:inline xmlns:a="http://schemas.openxmlformats.org/drawingml/2006/main" xmlns:pic="http://schemas.openxmlformats.org/drawingml/2006/picture">
             <wp:extent cx="6217920" cy="7551247"/>
-            <wp:docPr id="41" name="Picture 41"/>
+            <wp:docPr id="42" name="Picture 42"/>
             <wp:cNvGraphicFramePr>
               <a:graphicFrameLocks noChangeAspect="1"/>
             </wp:cNvGraphicFramePr>
@@ -10353,7 +10007,7 @@
                     <pic:cNvPicPr/>
                   </pic:nvPicPr>
                   <pic:blipFill>
-                    <a:blip r:embed="rId49"/>
+                    <a:blip r:embed="rId50"/>
                     <a:stretch>
                       <a:fillRect/>
                     </a:stretch>
@@ -10387,12 +10041,12 @@
         <w:pStyle w:val="Heading2"/>
       </w:pPr>
       <w:r>
-        <w:t>41. 2C3CCAEG4HH586472 — air-bags — 3: Passenger Air Bag</w:t>
+        <w:t>42. 2C3CCAEG4HH586472 — air-bags — 3: Passenger Air Bag</w:t>
       </w:r>
     </w:p>
     <w:p>
       <w:r>
-        <w:t>https://www.moparamerica.com/v-2017-chrysler-300--c--3-6l-v6-flex/restraints--air-bags?assembly=3</w:t>
+        <w:t>https://www.moparamerica.com/v-2017-chrysler-300--c--3-6l-v6-gas/restraints--air-bags?assembly=3</w:t>
       </w:r>
     </w:p>
     <w:p>
@@ -10403,7 +10057,7 @@
         <w:drawing>
           <wp:inline xmlns:a="http://schemas.openxmlformats.org/drawingml/2006/main" xmlns:pic="http://schemas.openxmlformats.org/drawingml/2006/picture">
             <wp:extent cx="6217920" cy="7551247"/>
-            <wp:docPr id="42" name="Picture 42"/>
+            <wp:docPr id="43" name="Picture 43"/>
             <wp:cNvGraphicFramePr>
               <a:graphicFrameLocks noChangeAspect="1"/>
             </wp:cNvGraphicFramePr>
@@ -10415,7 +10069,7 @@
                     <pic:cNvPicPr/>
                   </pic:nvPicPr>
                   <pic:blipFill>
-                    <a:blip r:embed="rId50"/>
+                    <a:blip r:embed="rId51"/>
                     <a:stretch>
                       <a:fillRect/>
                     </a:stretch>
@@ -10449,12 +10103,12 @@
         <w:pStyle w:val="Heading2"/>
       </w:pPr>
       <w:r>
-        <w:t>42. 2C3CCAEG4HH586472 — steering-column — 1: Steering Column 19</w:t>
+        <w:t>43. 2C3CCAEG4HH586472 — steering-column — 1: Steering Column 19</w:t>
       </w:r>
     </w:p>
     <w:p>
       <w:r>
-        <w:t>https://www.moparamerica.com/v-2017-chrysler-300--c--3-6l-v6-flex/steering--steering-column-and-intermediate-shaft</w:t>
+        <w:t>https://www.moparamerica.com/v-2017-chrysler-300--c--3-6l-v6-gas/steering--steering-column-and-intermediate-shaft</w:t>
       </w:r>
     </w:p>
     <w:p>
@@ -10465,7 +10119,7 @@
         <w:drawing>
           <wp:inline xmlns:a="http://schemas.openxmlformats.org/drawingml/2006/main" xmlns:pic="http://schemas.openxmlformats.org/drawingml/2006/picture">
             <wp:extent cx="6217920" cy="7551247"/>
-            <wp:docPr id="43" name="Picture 43"/>
+            <wp:docPr id="44" name="Picture 44"/>
             <wp:cNvGraphicFramePr>
               <a:graphicFrameLocks noChangeAspect="1"/>
             </wp:cNvGraphicFramePr>
@@ -10477,7 +10131,7 @@
                     <pic:cNvPicPr/>
                   </pic:nvPicPr>
                   <pic:blipFill>
-                    <a:blip r:embed="rId51"/>
+                    <a:blip r:embed="rId52"/>
                     <a:stretch>
                       <a:fillRect/>
                     </a:stretch>
@@ -10511,12 +10165,12 @@
         <w:pStyle w:val="Heading2"/>
       </w:pPr>
       <w:r>
-        <w:t>43. 2C3CCAEG4HH586472 — steering-wheel — 1: Steering Wheel</w:t>
+        <w:t>44. 2C3CCAEG4HH586472 — steering-wheel — 1: Steering Wheel</w:t>
       </w:r>
     </w:p>
     <w:p>
       <w:r>
-        <w:t>https://www.moparamerica.com/v-2017-chrysler-300--c--3-6l-v6-flex/steering--steering-wheel?assembly=1</w:t>
+        <w:t>https://www.moparamerica.com/v-2017-chrysler-300--c--3-6l-v6-gas/steering--steering-wheel?assembly=1</w:t>
       </w:r>
     </w:p>
     <w:p>
@@ -10527,7 +10181,7 @@
         <w:drawing>
           <wp:inline xmlns:a="http://schemas.openxmlformats.org/drawingml/2006/main" xmlns:pic="http://schemas.openxmlformats.org/drawingml/2006/picture">
             <wp:extent cx="6217920" cy="7551247"/>
-            <wp:docPr id="44" name="Picture 44"/>
+            <wp:docPr id="45" name="Picture 45"/>
             <wp:cNvGraphicFramePr>
               <a:graphicFrameLocks noChangeAspect="1"/>
             </wp:cNvGraphicFramePr>
@@ -10539,7 +10193,7 @@
                     <pic:cNvPicPr/>
                   </pic:nvPicPr>
                   <pic:blipFill>
-                    <a:blip r:embed="rId52"/>
+                    <a:blip r:embed="rId53"/>
                     <a:stretch>
                       <a:fillRect/>
                     </a:stretch>
@@ -10573,12 +10227,12 @@
         <w:pStyle w:val="Heading2"/>
       </w:pPr>
       <w:r>
-        <w:t>44. 2C3CCAEG4HH586472 — steering-wheel — 2: Steering Wheel</w:t>
+        <w:t>45. 2C3CCAEG4HH586472 — steering-wheel — 2: Steering Wheel</w:t>
       </w:r>
     </w:p>
     <w:p>
       <w:r>
-        <w:t>https://www.moparamerica.com/v-2017-chrysler-300--c--3-6l-v6-flex/steering--steering-wheel?assembly=2</w:t>
+        <w:t>https://www.moparamerica.com/v-2017-chrysler-300--c--3-6l-v6-gas/steering--steering-wheel?assembly=2</w:t>
       </w:r>
     </w:p>
     <w:p>
@@ -10589,7 +10243,7 @@
         <w:drawing>
           <wp:inline xmlns:a="http://schemas.openxmlformats.org/drawingml/2006/main" xmlns:pic="http://schemas.openxmlformats.org/drawingml/2006/picture">
             <wp:extent cx="6217920" cy="7551247"/>
-            <wp:docPr id="45" name="Picture 45"/>
+            <wp:docPr id="46" name="Picture 46"/>
             <wp:cNvGraphicFramePr>
               <a:graphicFrameLocks noChangeAspect="1"/>
             </wp:cNvGraphicFramePr>
@@ -10601,7 +10255,7 @@
                     <pic:cNvPicPr/>
                   </pic:nvPicPr>
                   <pic:blipFill>
-                    <a:blip r:embed="rId53"/>
+                    <a:blip r:embed="rId54"/>
                     <a:stretch>
                       <a:fillRect/>
                     </a:stretch>
@@ -10635,12 +10289,12 @@
         <w:pStyle w:val="Heading2"/>
       </w:pPr>
       <w:r>
-        <w:t>45. 2C3CCAEG4HH586472 — instrument-panel — 1: Instrument Panel Closeout Panel, Left, Inboard 122</w:t>
+        <w:t>46. 2C3CCAEG4HH586472 — instrument-panel — 1: Instrument Panel Closeout Panel, Left, Inboard 122</w:t>
       </w:r>
     </w:p>
     <w:p>
       <w:r>
-        <w:t>https://www.moparamerica.com/v-2017-chrysler-300--c--3-6l-v6-flex/interior-trim--instrument-panel</w:t>
+        <w:t>https://www.moparamerica.com/v-2017-chrysler-300--c--3-6l-v6-gas/interior-trim--instrument-panel</w:t>
       </w:r>
     </w:p>
     <w:p>
@@ -10651,7 +10305,7 @@
         <w:drawing>
           <wp:inline xmlns:a="http://schemas.openxmlformats.org/drawingml/2006/main" xmlns:pic="http://schemas.openxmlformats.org/drawingml/2006/picture">
             <wp:extent cx="6217920" cy="7551247"/>
-            <wp:docPr id="46" name="Picture 46"/>
+            <wp:docPr id="47" name="Picture 47"/>
             <wp:cNvGraphicFramePr>
               <a:graphicFrameLocks noChangeAspect="1"/>
             </wp:cNvGraphicFramePr>
@@ -10663,7 +10317,7 @@
                     <pic:cNvPicPr/>
                   </pic:nvPicPr>
                   <pic:blipFill>
-                    <a:blip r:embed="rId54"/>
+                    <a:blip r:embed="rId55"/>
                     <a:stretch>
                       <a:fillRect/>
                     </a:stretch>

</xml_diff>